<commit_message>
Removed Avast t-shoot and updated install script
Removed the Avast troubleshooting message when using Curl because I got rid of installing the Avast program with the scripts.  I also updated the install script section to indicate when the program will pause to wait for users to perform actions related to LibreOffice and Desktop icon cleanup.
</commit_message>
<xml_diff>
--- a/PowerShellScriptsAdam/Adams_PowerShell_Script_Instructions.docx
+++ b/PowerShellScriptsAdam/Adams_PowerShell_Script_Instructions.docx
@@ -667,78 +667,42 @@
         <w:bidi w:val="0"/>
         <w:ind w:hanging="0" w:left="720"/>
         <w:jc w:val="left"/>
-        <w:rPr/>
-      </w:pPr>
-      <w:r>
-        <w:rPr/>
-      </w:r>
-    </w:p>
-    <w:p>
-      <w:pPr>
-        <w:pStyle w:val="Normal"/>
-        <w:bidi w:val="0"/>
-        <w:ind w:hanging="0" w:left="709"/>
-        <w:jc w:val="left"/>
-        <w:rPr/>
-      </w:pPr>
-      <w:r>
         <w:rPr>
           <w:rFonts w:ascii="Lucida Console" w:hAnsi="Lucida Console"/>
           <w:sz w:val="28"/>
           <w:szCs w:val="28"/>
         </w:rPr>
-        <w:t>curl.exe -L “</w:t>
-      </w:r>
-      <w:hyperlink r:id="rId3">
-        <w:r>
-          <w:rPr>
-            <w:rStyle w:val="Hyperlink"/>
-            <w:rFonts w:ascii="Lucida Console" w:hAnsi="Lucida Console"/>
-            <w:sz w:val="28"/>
-            <w:szCs w:val="28"/>
-          </w:rPr>
-          <w:t>https://github.com/shimashi/kw-windows/archive/refs/heads/main.zip</w:t>
-        </w:r>
-      </w:hyperlink>
-      <w:r>
-        <w:rPr>
-          <w:rFonts w:ascii="Lucida Console" w:hAnsi="Lucida Console"/>
-          <w:sz w:val="28"/>
-          <w:szCs w:val="28"/>
-        </w:rPr>
-        <w:t>” -o “$env:USERPROFILE\Desktop\InstallScripts.zip”</w:t>
-      </w:r>
-    </w:p>
-    <w:p>
-      <w:pPr>
-        <w:pStyle w:val="Normal"/>
-        <w:bidi w:val="0"/>
-        <w:ind w:hanging="0" w:left="709"/>
-        <w:jc w:val="left"/>
-        <w:rPr>
-          <w:rFonts w:ascii="Lucida Console" w:hAnsi="Lucida Console"/>
-          <w:sz w:val="28"/>
-          <w:szCs w:val="28"/>
-        </w:rPr>
-      </w:pPr>
-      <w:r>
-        <w:rPr>
-          <w:rFonts w:ascii="Lucida Console" w:hAnsi="Lucida Console"/>
-          <w:sz w:val="28"/>
-          <w:szCs w:val="28"/>
-        </w:rPr>
+      </w:pPr>
+      <w:r>
+        <w:rPr/>
+      </w:r>
+    </w:p>
+    <w:p>
+      <w:pPr>
+        <w:pStyle w:val="Normal"/>
+        <w:numPr>
+          <w:ilvl w:val="0"/>
+          <w:numId w:val="0"/>
+        </w:numPr>
+        <w:bidi w:val="0"/>
+        <w:ind w:hanging="0" w:left="720"/>
+        <w:jc w:val="left"/>
+        <w:rPr/>
+      </w:pPr>
+      <w:r>
+        <w:rPr/>
         <mc:AlternateContent>
           <mc:Choice Requires="wps">
             <w:drawing>
-              <wp:anchor distT="0" distB="0" distL="0" distR="0" simplePos="0" relativeHeight="4" behindDoc="0" locked="0" layoutInCell="1" allowOverlap="1">
+              <wp:anchor distT="635" distB="635" distL="635" distR="635" simplePos="0" relativeHeight="4" behindDoc="0" locked="0" layoutInCell="1" allowOverlap="1">
                 <wp:simplePos x="0" y="0"/>
                 <wp:positionH relativeFrom="column">
                   <wp:posOffset>-5715</wp:posOffset>
                 </wp:positionH>
                 <wp:positionV relativeFrom="paragraph">
-                  <wp:posOffset>87630</wp:posOffset>
+                  <wp:posOffset>86995</wp:posOffset>
                 </wp:positionV>
-                <wp:extent cx="6248400" cy="0"/>
+                <wp:extent cx="6248400" cy="635"/>
                 <wp:effectExtent l="635" t="635" r="635" b="635"/>
                 <wp:wrapNone/>
                 <wp:docPr id="1" name="Horizontal line 2"/>
@@ -749,7 +713,7 @@
                       <wps:spPr>
                         <a:xfrm>
                           <a:off x="0" y="0"/>
-                          <a:ext cx="6248520" cy="0"/>
+                          <a:ext cx="6248520" cy="720"/>
                         </a:xfrm>
                         <a:prstGeom prst="line">
                           <a:avLst/>
@@ -775,7 +739,7 @@
           </mc:Choice>
           <mc:Fallback>
             <w:pict>
-              <v:line id="shape_0" from="-0.45pt,6.9pt" to="491.5pt,6.9pt" stroked="t" o:allowincell="f" style="position:absolute">
+              <v:line id="shape_0" from="-0.45pt,6.85pt" to="491.5pt,6.85pt" stroked="t" o:allowincell="f" style="position:absolute">
                 <v:stroke color="#3465a4" joinstyle="round" endcap="flat"/>
                 <v:fill o:detectmouseclick="t" on="false"/>
                 <w10:wrap type="none"/>
@@ -788,98 +752,37 @@
     <w:p>
       <w:pPr>
         <w:pStyle w:val="Normal"/>
-        <w:rPr/>
-      </w:pPr>
-      <w:r>
-        <w:rPr>
-          <w:b/>
-          <w:bCs/>
-        </w:rPr>
-        <w:t>Troubleshooting tip:</w:t>
-      </w:r>
-      <w:r>
-        <w:rPr/>
-        <w:t xml:space="preserve"> </w:t>
-      </w:r>
-      <w:r>
-        <w:rPr/>
-        <w:t xml:space="preserve">I noticed in June 2026 that </w:t>
-      </w:r>
-      <w:r>
-        <w:rPr>
-          <w:color w:val="C9211E"/>
-        </w:rPr>
-        <w:t>after installing Avast Free Antivirus software, the curl command fails.</w:t>
-      </w:r>
-      <w:r>
-        <w:rPr/>
-        <w:t xml:space="preserve">  To fix this, open up Avast Free Antivirus and click on:</w:t>
-      </w:r>
-    </w:p>
-    <w:p>
-      <w:pPr>
-        <w:pStyle w:val="Normal"/>
-        <w:rPr/>
-      </w:pPr>
-      <w:r>
-        <w:rPr/>
-      </w:r>
-    </w:p>
-    <w:p>
-      <w:pPr>
-        <w:pStyle w:val="Normal"/>
+        <w:bidi w:val="0"/>
         <w:ind w:hanging="0" w:left="709"/>
-        <w:rPr>
-          <w:rFonts w:ascii="Lucida Console" w:hAnsi="Lucida Console"/>
-        </w:rPr>
-      </w:pPr>
-      <w:r>
-        <w:rPr>
-          <w:rFonts w:ascii="Lucida Console" w:hAnsi="Lucida Console"/>
-        </w:rPr>
-        <w:t xml:space="preserve">Menu → Settings → Scam Guardian → </w:t>
-      </w:r>
-      <w:r>
-        <w:rPr>
-          <w:rFonts w:ascii="Lucida Console" w:hAnsi="Lucida Console"/>
-        </w:rPr>
-        <w:t>Dis</w:t>
-      </w:r>
-      <w:r>
-        <w:rPr>
-          <w:rFonts w:ascii="Lucida Console" w:hAnsi="Lucida Console"/>
-        </w:rPr>
-        <w:t xml:space="preserve">able HTTPS scanning </w:t>
-      </w:r>
-    </w:p>
-    <w:p>
-      <w:pPr>
-        <w:pStyle w:val="Normal"/>
-        <w:bidi w:val="0"/>
-        <w:ind w:hanging="0" w:left="709"/>
-        <w:jc w:val="left"/>
+        <w:jc w:val="left"/>
+        <w:rPr/>
+      </w:pPr>
+      <w:r>
         <w:rPr>
           <w:rFonts w:ascii="Lucida Console" w:hAnsi="Lucida Console"/>
           <w:sz w:val="28"/>
           <w:szCs w:val="28"/>
         </w:rPr>
-      </w:pPr>
+        <w:t>curl.exe -L “</w:t>
+      </w:r>
+      <w:hyperlink r:id="rId3">
+        <w:r>
+          <w:rPr>
+            <w:rStyle w:val="Hyperlink"/>
+            <w:rFonts w:ascii="Lucida Console" w:hAnsi="Lucida Console"/>
+            <w:sz w:val="28"/>
+            <w:szCs w:val="28"/>
+          </w:rPr>
+          <w:t>https://github.com/shimashi/kw-windows/archive/refs/heads/main.zip</w:t>
+        </w:r>
+      </w:hyperlink>
       <w:r>
         <w:rPr>
           <w:rFonts w:ascii="Lucida Console" w:hAnsi="Lucida Console"/>
           <w:sz w:val="28"/>
           <w:szCs w:val="28"/>
         </w:rPr>
-      </w:r>
-    </w:p>
-    <w:p>
-      <w:pPr>
-        <w:pStyle w:val="Normal"/>
-        <w:rPr/>
-      </w:pPr>
-      <w:r>
-        <w:rPr/>
-        <w:t>Ideally, when you are done refurbishing the computer, change the Avast setting back to enable HTTPS scanning.</w:t>
+        <w:t>” -o “$env:USERPROFILE\Desktop\InstallScripts.zip”</w:t>
       </w:r>
     </w:p>
     <w:p>
@@ -892,15 +795,15 @@
         <mc:AlternateContent>
           <mc:Choice Requires="wps">
             <w:drawing>
-              <wp:anchor distT="0" distB="0" distL="0" distR="0" simplePos="0" relativeHeight="3" behindDoc="0" locked="0" layoutInCell="1" allowOverlap="1">
+              <wp:anchor distT="635" distB="635" distL="635" distR="635" simplePos="0" relativeHeight="3" behindDoc="0" locked="0" layoutInCell="1" allowOverlap="1">
                 <wp:simplePos x="0" y="0"/>
                 <wp:positionH relativeFrom="column">
                   <wp:posOffset>32385</wp:posOffset>
                 </wp:positionH>
                 <wp:positionV relativeFrom="paragraph">
-                  <wp:posOffset>157480</wp:posOffset>
+                  <wp:posOffset>156845</wp:posOffset>
                 </wp:positionV>
-                <wp:extent cx="6223000" cy="0"/>
+                <wp:extent cx="6223000" cy="635"/>
                 <wp:effectExtent l="635" t="635" r="635" b="635"/>
                 <wp:wrapNone/>
                 <wp:docPr id="2" name="Horizontal line 1"/>
@@ -911,7 +814,7 @@
                       <wps:spPr>
                         <a:xfrm>
                           <a:off x="0" y="0"/>
-                          <a:ext cx="6222960" cy="0"/>
+                          <a:ext cx="6222960" cy="720"/>
                         </a:xfrm>
                         <a:prstGeom prst="line">
                           <a:avLst/>
@@ -937,7 +840,7 @@
           </mc:Choice>
           <mc:Fallback>
             <w:pict>
-              <v:line id="shape_0" from="2.55pt,12.4pt" to="492.5pt,12.4pt" stroked="t" o:allowincell="f" style="position:absolute">
+              <v:line id="shape_0" from="2.55pt,12.35pt" to="492.5pt,12.35pt" stroked="t" o:allowincell="f" style="position:absolute">
                 <v:stroke color="#3465a4" joinstyle="round" endcap="flat"/>
                 <v:fill o:detectmouseclick="t" on="false"/>
                 <w10:wrap type="none"/>
@@ -945,22 +848,6 @@
             </w:pict>
           </mc:Fallback>
         </mc:AlternateContent>
-      </w:r>
-    </w:p>
-    <w:p>
-      <w:pPr>
-        <w:pStyle w:val="Normal"/>
-        <w:numPr>
-          <w:ilvl w:val="0"/>
-          <w:numId w:val="0"/>
-        </w:numPr>
-        <w:bidi w:val="0"/>
-        <w:ind w:hanging="0" w:left="1080"/>
-        <w:jc w:val="left"/>
-        <w:rPr/>
-      </w:pPr>
-      <w:r>
-        <w:rPr/>
       </w:r>
     </w:p>
     <w:p>
@@ -1226,7 +1113,15 @@
       </w:pPr>
       <w:r>
         <w:rPr/>
-        <w:t>Note that the reason we’re copying files directly to the C: drive is because doing so will avoid Windows permissions issues if the user decides to add another user to the computer in the future.</w:t>
+        <w:t xml:space="preserve">Note that the reason we’re copying files directly to the C: drive is because doing so will avoid Windows permissions issues </w:t>
+      </w:r>
+      <w:r>
+        <w:rPr/>
+        <w:t xml:space="preserve">later on </w:t>
+      </w:r>
+      <w:r>
+        <w:rPr/>
+        <w:t>if the user decides to add another user to the computer in the future.</w:t>
       </w:r>
     </w:p>
     <w:p>
@@ -1442,6 +1337,182 @@
           <w:bCs w:val="false"/>
         </w:rPr>
         <w:t>While the script is running, you may see a Windows Explorer window pop up. That is done on purpose, and you can safely close that file explorer window.</w:t>
+      </w:r>
+    </w:p>
+    <w:p>
+      <w:pPr>
+        <w:pStyle w:val="Normal"/>
+        <w:numPr>
+          <w:ilvl w:val="0"/>
+          <w:numId w:val="0"/>
+        </w:numPr>
+        <w:bidi w:val="0"/>
+        <w:ind w:hanging="0" w:left="1080"/>
+        <w:jc w:val="left"/>
+        <w:rPr>
+          <w:b w:val="false"/>
+          <w:bCs w:val="false"/>
+        </w:rPr>
+      </w:pPr>
+      <w:r>
+        <w:rPr>
+          <w:b w:val="false"/>
+          <w:bCs w:val="false"/>
+        </w:rPr>
+      </w:r>
+    </w:p>
+    <w:p>
+      <w:pPr>
+        <w:pStyle w:val="Normal"/>
+        <w:numPr>
+          <w:ilvl w:val="1"/>
+          <w:numId w:val="5"/>
+        </w:numPr>
+        <w:bidi w:val="0"/>
+        <w:jc w:val="left"/>
+        <w:rPr>
+          <w:b w:val="false"/>
+          <w:bCs w:val="false"/>
+        </w:rPr>
+      </w:pPr>
+      <w:r>
+        <w:rPr>
+          <w:b w:val="false"/>
+          <w:bCs w:val="false"/>
+        </w:rPr>
+        <w:t>The script will pause twice for your actions while running</w:t>
+      </w:r>
+    </w:p>
+    <w:p>
+      <w:pPr>
+        <w:pStyle w:val="Normal"/>
+        <w:numPr>
+          <w:ilvl w:val="2"/>
+          <w:numId w:val="5"/>
+        </w:numPr>
+        <w:bidi w:val="0"/>
+        <w:jc w:val="left"/>
+        <w:rPr>
+          <w:b w:val="false"/>
+          <w:bCs w:val="false"/>
+        </w:rPr>
+      </w:pPr>
+      <w:r>
+        <w:rPr>
+          <w:b w:val="false"/>
+          <w:bCs w:val="false"/>
+        </w:rPr>
+        <w:t>Once to ask if you would like to adjust the LibreOffice default file save formats</w:t>
+      </w:r>
+    </w:p>
+    <w:p>
+      <w:pPr>
+        <w:pStyle w:val="Normal"/>
+        <w:numPr>
+          <w:ilvl w:val="3"/>
+          <w:numId w:val="5"/>
+        </w:numPr>
+        <w:bidi w:val="0"/>
+        <w:jc w:val="left"/>
+        <w:rPr>
+          <w:b w:val="false"/>
+          <w:bCs w:val="false"/>
+        </w:rPr>
+      </w:pPr>
+      <w:r>
+        <w:rPr>
+          <w:b w:val="false"/>
+          <w:bCs w:val="false"/>
+        </w:rPr>
+        <w:t xml:space="preserve">If you enter “Y” then please wait two minutes and be patient while LibreOffice boots up for the first time </w:t>
+      </w:r>
+    </w:p>
+    <w:p>
+      <w:pPr>
+        <w:pStyle w:val="Normal"/>
+        <w:numPr>
+          <w:ilvl w:val="3"/>
+          <w:numId w:val="5"/>
+        </w:numPr>
+        <w:bidi w:val="0"/>
+        <w:jc w:val="left"/>
+        <w:rPr>
+          <w:b w:val="false"/>
+          <w:bCs w:val="false"/>
+        </w:rPr>
+      </w:pPr>
+      <w:r>
+        <w:rPr>
+          <w:b w:val="false"/>
+          <w:bCs w:val="false"/>
+        </w:rPr>
+        <w:t>Instructions are printed on the PowerShell terminal for what to do in LibreOffice</w:t>
+      </w:r>
+    </w:p>
+    <w:p>
+      <w:pPr>
+        <w:pStyle w:val="Normal"/>
+        <w:numPr>
+          <w:ilvl w:val="0"/>
+          <w:numId w:val="0"/>
+        </w:numPr>
+        <w:bidi w:val="0"/>
+        <w:ind w:hanging="0" w:left="1800"/>
+        <w:jc w:val="left"/>
+        <w:rPr>
+          <w:b w:val="false"/>
+          <w:bCs w:val="false"/>
+        </w:rPr>
+      </w:pPr>
+      <w:r>
+        <w:rPr>
+          <w:b w:val="false"/>
+          <w:bCs w:val="false"/>
+        </w:rPr>
+      </w:r>
+    </w:p>
+    <w:p>
+      <w:pPr>
+        <w:pStyle w:val="Normal"/>
+        <w:numPr>
+          <w:ilvl w:val="2"/>
+          <w:numId w:val="5"/>
+        </w:numPr>
+        <w:bidi w:val="0"/>
+        <w:jc w:val="left"/>
+        <w:rPr>
+          <w:b w:val="false"/>
+          <w:bCs w:val="false"/>
+        </w:rPr>
+      </w:pPr>
+      <w:r>
+        <w:rPr>
+          <w:b w:val="false"/>
+          <w:bCs w:val="false"/>
+        </w:rPr>
+        <w:t>Once to pause to give you a chance to follow the instructions to clean up the arrangement of Desktop icons.</w:t>
+      </w:r>
+    </w:p>
+    <w:p>
+      <w:pPr>
+        <w:pStyle w:val="Normal"/>
+        <w:numPr>
+          <w:ilvl w:val="3"/>
+          <w:numId w:val="5"/>
+        </w:numPr>
+        <w:bidi w:val="0"/>
+        <w:jc w:val="left"/>
+        <w:rPr>
+          <w:b w:val="false"/>
+          <w:bCs w:val="false"/>
+        </w:rPr>
+      </w:pPr>
+      <w:r>
+        <w:rPr>
+          <w:b w:val="false"/>
+          <w:bCs w:val="false"/>
+        </w:rPr>
+        <w:t>Instructions are printed on the PowerShell terminal for what to do in Windows Desktop settings</w:t>
       </w:r>
     </w:p>
     <w:p>
@@ -2504,6 +2575,38 @@
       <w:r>
         <w:rPr/>
         <w:t>Run the Chrome installation file in the C:\Users\User\Downloads folder.</w:t>
+      </w:r>
+    </w:p>
+    <w:p>
+      <w:pPr>
+        <w:pStyle w:val="BodyText"/>
+        <w:spacing w:before="0" w:after="140"/>
+        <w:rPr/>
+      </w:pPr>
+      <w:r>
+        <w:rPr/>
+      </w:r>
+    </w:p>
+    <w:p>
+      <w:pPr>
+        <w:pStyle w:val="BodyText"/>
+        <w:spacing w:before="0" w:after="140"/>
+        <w:rPr/>
+      </w:pPr>
+      <w:r>
+        <w:rPr/>
+        <w:t xml:space="preserve">At this point, you can run the </w:t>
+      </w:r>
+      <w:r>
+        <w:rPr>
+          <w:b/>
+          <w:bCs/>
+        </w:rPr>
+        <w:t>NovaBench</w:t>
+      </w:r>
+      <w:r>
+        <w:rPr/>
+        <w:t xml:space="preserve"> application to get your benchmark test values.</w:t>
       </w:r>
     </w:p>
     <w:sectPr>
@@ -4475,8 +4578,8 @@
     <w:qFormat/>
     <w:rPr/>
   </w:style>
-  <w:style w:type="character" w:styleId="Bulletsuser">
-    <w:name w:val="Bullets (user)"/>
+  <w:style w:type="character" w:styleId="Bullets">
+    <w:name w:val="Bullets"/>
     <w:qFormat/>
     <w:rPr>
       <w:rFonts w:ascii="OpenSymbol" w:hAnsi="OpenSymbol" w:eastAsia="OpenSymbol" w:cs="OpenSymbol"/>
@@ -4496,8 +4599,8 @@
       <w:u w:val="single"/>
     </w:rPr>
   </w:style>
-  <w:style w:type="character" w:styleId="Bullets">
-    <w:name w:val="Bullets"/>
+  <w:style w:type="character" w:styleId="Bulletsuser">
+    <w:name w:val="Bullets (user)"/>
     <w:qFormat/>
     <w:rPr>
       <w:rFonts w:ascii="OpenSymbol" w:hAnsi="OpenSymbol" w:eastAsia="OpenSymbol" w:cs="OpenSymbol"/>

</xml_diff>

<commit_message>
Updated per 9-20-2026 meeting decisions
Updated per the 9-20-2026 refurbisher meeting decisions.  Mostly removed references to installing Chrome, which we decided was excessive.  Users only need Edge and Firefox because Chrome did not install or update properly with Chocolatey.
</commit_message>
<xml_diff>
--- a/PowerShellScriptsAdam/Adams_PowerShell_Script_Instructions.docx
+++ b/PowerShellScriptsAdam/Adams_PowerShell_Script_Instructions.docx
@@ -96,30 +96,44 @@
           <w:sz w:val="36"/>
           <w:szCs w:val="36"/>
         </w:rPr>
-        <w:t>Updated July 2026</w:t>
-      </w:r>
-    </w:p>
-    <w:p>
-      <w:pPr>
-        <w:pStyle w:val="Normal"/>
-        <w:bidi w:val="0"/>
-        <w:jc w:val="left"/>
-        <w:rPr/>
-      </w:pPr>
-      <w:r>
-        <w:rPr/>
-      </w:r>
-    </w:p>
-    <w:p>
-      <w:pPr>
-        <w:pStyle w:val="Normal"/>
-        <w:bidi w:val="0"/>
-        <w:jc w:val="left"/>
-        <w:rPr/>
-      </w:pPr>
-      <w:r>
-        <w:rPr/>
-        <w:t>The purpose of these PowerShell and Command Prompt scripts is to facilitate the installation of applications on refurbished Windows computers once they have Windows installed on them and have Internet access.  These scripts also perform a few Windows setting changes through script automation that refurbisher’s would normally have to perform manually.</w:t>
+        <w:t xml:space="preserve">Updated </w:t>
+      </w:r>
+      <w:r>
+        <w:rPr>
+          <w:sz w:val="36"/>
+          <w:szCs w:val="36"/>
+        </w:rPr>
+        <w:t>September</w:t>
+      </w:r>
+      <w:r>
+        <w:rPr>
+          <w:sz w:val="36"/>
+          <w:szCs w:val="36"/>
+        </w:rPr>
+        <w:t xml:space="preserve"> 2026</w:t>
+      </w:r>
+    </w:p>
+    <w:p>
+      <w:pPr>
+        <w:pStyle w:val="Normal"/>
+        <w:bidi w:val="0"/>
+        <w:jc w:val="left"/>
+        <w:rPr/>
+      </w:pPr>
+      <w:r>
+        <w:rPr/>
+      </w:r>
+    </w:p>
+    <w:p>
+      <w:pPr>
+        <w:pStyle w:val="Normal"/>
+        <w:bidi w:val="0"/>
+        <w:jc w:val="left"/>
+        <w:rPr/>
+      </w:pPr>
+      <w:r>
+        <w:rPr/>
+        <w:t>The purpose of these PowerShell and Command Prompt scripts is to facilitate the installation of applications on refurbished Windows computers once they have Windows installed on them and have Internet access.  These scripts also perform a few Windows setting changes through script automation that refurbishers would normally have to perform manually.</w:t>
       </w:r>
     </w:p>
     <w:p>
@@ -202,7 +216,7 @@
         <w:pStyle w:val="Heading1"/>
         <w:numPr>
           <w:ilvl w:val="0"/>
-          <w:numId w:val="1"/>
+          <w:numId w:val="2"/>
         </w:numPr>
         <w:ind w:hanging="0" w:left="0"/>
         <w:rPr/>
@@ -249,7 +263,7 @@
         <w:widowControl/>
         <w:numPr>
           <w:ilvl w:val="1"/>
-          <w:numId w:val="3"/>
+          <w:numId w:val="4"/>
         </w:numPr>
         <w:suppressAutoHyphens w:val="true"/>
         <w:bidi w:val="0"/>
@@ -313,7 +327,7 @@
         <w:pStyle w:val="Heading2"/>
         <w:numPr>
           <w:ilvl w:val="1"/>
-          <w:numId w:val="3"/>
+          <w:numId w:val="4"/>
         </w:numPr>
         <w:bidi w:val="0"/>
         <w:ind w:hanging="0" w:left="0"/>
@@ -329,7 +343,7 @@
         <w:pStyle w:val="Heading2"/>
         <w:numPr>
           <w:ilvl w:val="1"/>
-          <w:numId w:val="3"/>
+          <w:numId w:val="4"/>
         </w:numPr>
         <w:bidi w:val="0"/>
         <w:ind w:hanging="0" w:left="0"/>
@@ -371,7 +385,7 @@
         <w:widowControl/>
         <w:numPr>
           <w:ilvl w:val="1"/>
-          <w:numId w:val="3"/>
+          <w:numId w:val="4"/>
         </w:numPr>
         <w:suppressAutoHyphens w:val="true"/>
         <w:bidi w:val="0"/>
@@ -441,7 +455,7 @@
         <w:widowControl/>
         <w:numPr>
           <w:ilvl w:val="1"/>
-          <w:numId w:val="3"/>
+          <w:numId w:val="4"/>
         </w:numPr>
         <w:suppressAutoHyphens w:val="true"/>
         <w:bidi w:val="0"/>
@@ -545,7 +559,7 @@
         <w:pStyle w:val="Heading1"/>
         <w:numPr>
           <w:ilvl w:val="0"/>
-          <w:numId w:val="1"/>
+          <w:numId w:val="2"/>
         </w:numPr>
         <w:ind w:hanging="0" w:left="0"/>
         <w:rPr/>
@@ -590,7 +604,7 @@
         <w:pStyle w:val="Heading3"/>
         <w:numPr>
           <w:ilvl w:val="2"/>
-          <w:numId w:val="2"/>
+          <w:numId w:val="3"/>
         </w:numPr>
         <w:ind w:hanging="0" w:left="0"/>
         <w:rPr/>
@@ -604,7 +618,7 @@
         <w:pStyle w:val="Heading3"/>
         <w:numPr>
           <w:ilvl w:val="2"/>
-          <w:numId w:val="2"/>
+          <w:numId w:val="3"/>
         </w:numPr>
         <w:ind w:hanging="0" w:left="0"/>
         <w:rPr/>
@@ -630,7 +644,7 @@
         <w:pStyle w:val="Normal"/>
         <w:numPr>
           <w:ilvl w:val="0"/>
-          <w:numId w:val="4"/>
+          <w:numId w:val="5"/>
         </w:numPr>
         <w:bidi w:val="0"/>
         <w:jc w:val="left"/>
@@ -646,7 +660,7 @@
         <w:pStyle w:val="Normal"/>
         <w:numPr>
           <w:ilvl w:val="0"/>
-          <w:numId w:val="4"/>
+          <w:numId w:val="5"/>
         </w:numPr>
         <w:bidi w:val="0"/>
         <w:jc w:val="left"/>
@@ -674,7 +688,11 @@
         </w:rPr>
       </w:pPr>
       <w:r>
-        <w:rPr/>
+        <w:rPr>
+          <w:rFonts w:ascii="Lucida Console" w:hAnsi="Lucida Console"/>
+          <w:sz w:val="28"/>
+          <w:szCs w:val="28"/>
+        </w:rPr>
       </w:r>
     </w:p>
     <w:p>
@@ -720,7 +738,7 @@
                         </a:prstGeom>
                         <a:ln w="0">
                           <a:solidFill>
-                            <a:srgbClr val="3465A4"/>
+                            <a:srgbClr val="3465a4"/>
                           </a:solidFill>
                         </a:ln>
                       </wps:spPr>
@@ -821,7 +839,7 @@
                         </a:prstGeom>
                         <a:ln w="0">
                           <a:solidFill>
-                            <a:srgbClr val="3465A4"/>
+                            <a:srgbClr val="3465a4"/>
                           </a:solidFill>
                         </a:ln>
                       </wps:spPr>
@@ -855,7 +873,7 @@
         <w:pStyle w:val="Normal"/>
         <w:numPr>
           <w:ilvl w:val="0"/>
-          <w:numId w:val="4"/>
+          <w:numId w:val="5"/>
         </w:numPr>
         <w:bidi w:val="0"/>
         <w:jc w:val="left"/>
@@ -882,7 +900,7 @@
         <w:pStyle w:val="Normal"/>
         <w:numPr>
           <w:ilvl w:val="0"/>
-          <w:numId w:val="4"/>
+          <w:numId w:val="5"/>
         </w:numPr>
         <w:bidi w:val="0"/>
         <w:jc w:val="left"/>
@@ -912,7 +930,7 @@
         <w:pStyle w:val="Normal"/>
         <w:numPr>
           <w:ilvl w:val="0"/>
-          <w:numId w:val="4"/>
+          <w:numId w:val="5"/>
         </w:numPr>
         <w:bidi w:val="0"/>
         <w:jc w:val="left"/>
@@ -948,7 +966,7 @@
         <w:pStyle w:val="Normal"/>
         <w:numPr>
           <w:ilvl w:val="0"/>
-          <w:numId w:val="4"/>
+          <w:numId w:val="5"/>
         </w:numPr>
         <w:bidi w:val="0"/>
         <w:jc w:val="left"/>
@@ -984,7 +1002,7 @@
         <w:pStyle w:val="Normal"/>
         <w:numPr>
           <w:ilvl w:val="0"/>
-          <w:numId w:val="4"/>
+          <w:numId w:val="5"/>
         </w:numPr>
         <w:bidi w:val="0"/>
         <w:jc w:val="left"/>
@@ -1017,7 +1035,7 @@
         <w:pStyle w:val="Normal"/>
         <w:numPr>
           <w:ilvl w:val="0"/>
-          <w:numId w:val="4"/>
+          <w:numId w:val="5"/>
         </w:numPr>
         <w:bidi w:val="0"/>
         <w:jc w:val="left"/>
@@ -1113,15 +1131,7 @@
       </w:pPr>
       <w:r>
         <w:rPr/>
-        <w:t xml:space="preserve">Note that the reason we’re copying files directly to the C: drive is because doing so will avoid Windows permissions issues </w:t>
-      </w:r>
-      <w:r>
-        <w:rPr/>
-        <w:t xml:space="preserve">later on </w:t>
-      </w:r>
-      <w:r>
-        <w:rPr/>
-        <w:t>if the user decides to add another user to the computer in the future.</w:t>
+        <w:t>Note that the reason we’re copying files directly to the C: drive is because doing so will avoid Windows permissions issues later on if the user decides to add another user to the computer in the future.</w:t>
       </w:r>
     </w:p>
     <w:p>
@@ -1145,7 +1155,7 @@
         <w:pStyle w:val="Normal"/>
         <w:numPr>
           <w:ilvl w:val="1"/>
-          <w:numId w:val="5"/>
+          <w:numId w:val="6"/>
         </w:numPr>
         <w:bidi w:val="0"/>
         <w:jc w:val="left"/>
@@ -1161,7 +1171,7 @@
         <w:pStyle w:val="Normal"/>
         <w:numPr>
           <w:ilvl w:val="2"/>
-          <w:numId w:val="5"/>
+          <w:numId w:val="6"/>
         </w:numPr>
         <w:bidi w:val="0"/>
         <w:jc w:val="left"/>
@@ -1233,7 +1243,7 @@
         <w:pStyle w:val="Normal"/>
         <w:numPr>
           <w:ilvl w:val="1"/>
-          <w:numId w:val="5"/>
+          <w:numId w:val="6"/>
         </w:numPr>
         <w:bidi w:val="0"/>
         <w:jc w:val="left"/>
@@ -1278,7 +1288,7 @@
         <w:pStyle w:val="Normal"/>
         <w:numPr>
           <w:ilvl w:val="1"/>
-          <w:numId w:val="5"/>
+          <w:numId w:val="6"/>
         </w:numPr>
         <w:bidi w:val="0"/>
         <w:jc w:val="left"/>
@@ -1322,7 +1332,7 @@
         <w:pStyle w:val="Normal"/>
         <w:numPr>
           <w:ilvl w:val="1"/>
-          <w:numId w:val="5"/>
+          <w:numId w:val="6"/>
         </w:numPr>
         <w:bidi w:val="0"/>
         <w:jc w:val="left"/>
@@ -1366,7 +1376,7 @@
         <w:pStyle w:val="Normal"/>
         <w:numPr>
           <w:ilvl w:val="1"/>
-          <w:numId w:val="5"/>
+          <w:numId w:val="6"/>
         </w:numPr>
         <w:bidi w:val="0"/>
         <w:jc w:val="left"/>
@@ -1388,7 +1398,7 @@
         <w:pStyle w:val="Normal"/>
         <w:numPr>
           <w:ilvl w:val="2"/>
-          <w:numId w:val="5"/>
+          <w:numId w:val="6"/>
         </w:numPr>
         <w:bidi w:val="0"/>
         <w:jc w:val="left"/>
@@ -1410,7 +1420,7 @@
         <w:pStyle w:val="Normal"/>
         <w:numPr>
           <w:ilvl w:val="3"/>
-          <w:numId w:val="5"/>
+          <w:numId w:val="6"/>
         </w:numPr>
         <w:bidi w:val="0"/>
         <w:jc w:val="left"/>
@@ -1432,7 +1442,7 @@
         <w:pStyle w:val="Normal"/>
         <w:numPr>
           <w:ilvl w:val="3"/>
-          <w:numId w:val="5"/>
+          <w:numId w:val="6"/>
         </w:numPr>
         <w:bidi w:val="0"/>
         <w:jc w:val="left"/>
@@ -1476,7 +1486,7 @@
         <w:pStyle w:val="Normal"/>
         <w:numPr>
           <w:ilvl w:val="2"/>
-          <w:numId w:val="5"/>
+          <w:numId w:val="6"/>
         </w:numPr>
         <w:bidi w:val="0"/>
         <w:jc w:val="left"/>
@@ -1498,7 +1508,7 @@
         <w:pStyle w:val="Normal"/>
         <w:numPr>
           <w:ilvl w:val="3"/>
-          <w:numId w:val="5"/>
+          <w:numId w:val="6"/>
         </w:numPr>
         <w:bidi w:val="0"/>
         <w:jc w:val="left"/>
@@ -1574,7 +1584,7 @@
         <w:pStyle w:val="Normal"/>
         <w:numPr>
           <w:ilvl w:val="0"/>
-          <w:numId w:val="4"/>
+          <w:numId w:val="5"/>
         </w:numPr>
         <w:bidi w:val="0"/>
         <w:jc w:val="left"/>
@@ -1634,7 +1644,7 @@
         <w:pStyle w:val="Heading3"/>
         <w:numPr>
           <w:ilvl w:val="2"/>
-          <w:numId w:val="2"/>
+          <w:numId w:val="3"/>
         </w:numPr>
         <w:ind w:hanging="0" w:left="0"/>
         <w:rPr/>
@@ -1669,7 +1679,7 @@
         <w:pStyle w:val="Normal"/>
         <w:numPr>
           <w:ilvl w:val="0"/>
-          <w:numId w:val="15"/>
+          <w:numId w:val="14"/>
         </w:numPr>
         <w:bidi w:val="0"/>
         <w:jc w:val="left"/>
@@ -1720,7 +1730,7 @@
         <w:pStyle w:val="Normal"/>
         <w:numPr>
           <w:ilvl w:val="1"/>
-          <w:numId w:val="6"/>
+          <w:numId w:val="7"/>
         </w:numPr>
         <w:bidi w:val="0"/>
         <w:jc w:val="left"/>
@@ -1765,7 +1775,7 @@
         <w:pStyle w:val="Normal"/>
         <w:numPr>
           <w:ilvl w:val="2"/>
-          <w:numId w:val="6"/>
+          <w:numId w:val="7"/>
         </w:numPr>
         <w:bidi w:val="0"/>
         <w:jc w:val="left"/>
@@ -1826,7 +1836,7 @@
         <w:pStyle w:val="Normal"/>
         <w:numPr>
           <w:ilvl w:val="0"/>
-          <w:numId w:val="4"/>
+          <w:numId w:val="5"/>
         </w:numPr>
         <w:bidi w:val="0"/>
         <w:jc w:val="left"/>
@@ -1870,7 +1880,7 @@
         <w:pStyle w:val="Normal"/>
         <w:numPr>
           <w:ilvl w:val="1"/>
-          <w:numId w:val="7"/>
+          <w:numId w:val="8"/>
         </w:numPr>
         <w:bidi w:val="0"/>
         <w:jc w:val="left"/>
@@ -1928,7 +1938,7 @@
         <w:pStyle w:val="Normal"/>
         <w:numPr>
           <w:ilvl w:val="0"/>
-          <w:numId w:val="4"/>
+          <w:numId w:val="5"/>
         </w:numPr>
         <w:bidi w:val="0"/>
         <w:jc w:val="left"/>
@@ -1988,7 +1998,7 @@
         <w:pStyle w:val="Normal"/>
         <w:numPr>
           <w:ilvl w:val="1"/>
-          <w:numId w:val="8"/>
+          <w:numId w:val="9"/>
         </w:numPr>
         <w:bidi w:val="0"/>
         <w:jc w:val="left"/>
@@ -2029,7 +2039,7 @@
         <w:pStyle w:val="Normal"/>
         <w:numPr>
           <w:ilvl w:val="0"/>
-          <w:numId w:val="4"/>
+          <w:numId w:val="5"/>
         </w:numPr>
         <w:bidi w:val="0"/>
         <w:jc w:val="left"/>
@@ -2073,7 +2083,7 @@
         <w:pStyle w:val="Normal"/>
         <w:numPr>
           <w:ilvl w:val="0"/>
-          <w:numId w:val="4"/>
+          <w:numId w:val="5"/>
         </w:numPr>
         <w:bidi w:val="0"/>
         <w:jc w:val="left"/>
@@ -2129,7 +2139,7 @@
         <w:pStyle w:val="Heading3"/>
         <w:numPr>
           <w:ilvl w:val="2"/>
-          <w:numId w:val="2"/>
+          <w:numId w:val="3"/>
         </w:numPr>
         <w:ind w:hanging="0" w:left="0"/>
         <w:rPr/>
@@ -2165,7 +2175,7 @@
         <w:pStyle w:val="Heading"/>
         <w:numPr>
           <w:ilvl w:val="2"/>
-          <w:numId w:val="2"/>
+          <w:numId w:val="3"/>
         </w:numPr>
         <w:rPr/>
       </w:pPr>
@@ -2179,7 +2189,7 @@
         <w:pStyle w:val="BodyText"/>
         <w:numPr>
           <w:ilvl w:val="2"/>
-          <w:numId w:val="2"/>
+          <w:numId w:val="3"/>
         </w:numPr>
         <w:rPr/>
       </w:pPr>
@@ -2192,7 +2202,7 @@
         <w:pStyle w:val="BodyText"/>
         <w:numPr>
           <w:ilvl w:val="0"/>
-          <w:numId w:val="9"/>
+          <w:numId w:val="10"/>
         </w:numPr>
         <w:rPr/>
       </w:pPr>
@@ -2217,7 +2227,7 @@
         <w:pStyle w:val="BodyText"/>
         <w:numPr>
           <w:ilvl w:val="0"/>
-          <w:numId w:val="9"/>
+          <w:numId w:val="10"/>
         </w:numPr>
         <w:rPr/>
       </w:pPr>
@@ -2242,7 +2252,7 @@
         <w:pStyle w:val="BodyText"/>
         <w:numPr>
           <w:ilvl w:val="0"/>
-          <w:numId w:val="9"/>
+          <w:numId w:val="10"/>
         </w:numPr>
         <w:rPr/>
       </w:pPr>
@@ -2267,7 +2277,7 @@
         <w:pStyle w:val="BodyText"/>
         <w:numPr>
           <w:ilvl w:val="0"/>
-          <w:numId w:val="9"/>
+          <w:numId w:val="10"/>
         </w:numPr>
         <w:rPr/>
       </w:pPr>
@@ -2287,7 +2297,7 @@
       </w:pPr>
       <w:r>
         <w:rPr/>
-        <w:t>If the KindWorks plan is not selected, then click the raidial button to select it now.</w:t>
+        <w:t>If the KindWorks plan is not selected, then click the radial button to select it now.</w:t>
       </w:r>
     </w:p>
     <w:p>
@@ -2295,7 +2305,7 @@
         <w:pStyle w:val="BodyText"/>
         <w:numPr>
           <w:ilvl w:val="0"/>
-          <w:numId w:val="9"/>
+          <w:numId w:val="10"/>
         </w:numPr>
         <w:rPr/>
       </w:pPr>
@@ -2309,7 +2319,7 @@
         <w:pStyle w:val="BodyText"/>
         <w:numPr>
           <w:ilvl w:val="1"/>
-          <w:numId w:val="9"/>
+          <w:numId w:val="10"/>
         </w:numPr>
         <w:rPr/>
       </w:pPr>
@@ -2323,7 +2333,7 @@
         <w:pStyle w:val="BodyText"/>
         <w:numPr>
           <w:ilvl w:val="1"/>
-          <w:numId w:val="9"/>
+          <w:numId w:val="10"/>
         </w:numPr>
         <w:rPr/>
       </w:pPr>
@@ -2344,7 +2354,7 @@
         <w:pStyle w:val="BodyText"/>
         <w:numPr>
           <w:ilvl w:val="1"/>
-          <w:numId w:val="9"/>
+          <w:numId w:val="10"/>
         </w:numPr>
         <w:rPr/>
       </w:pPr>
@@ -2418,7 +2428,7 @@
         <w:pStyle w:val="BodyText"/>
         <w:numPr>
           <w:ilvl w:val="1"/>
-          <w:numId w:val="2"/>
+          <w:numId w:val="3"/>
         </w:numPr>
         <w:rPr/>
       </w:pPr>
@@ -2502,85 +2512,10 @@
       <w:pPr>
         <w:pStyle w:val="Heading"/>
         <w:numPr>
-          <w:ilvl w:val="2"/>
-          <w:numId w:val="2"/>
-        </w:numPr>
-        <w:rPr/>
-      </w:pPr>
-      <w:r>
-        <w:rPr/>
-        <w:t>Install Google Chrome</w:t>
-      </w:r>
-    </w:p>
-    <w:p>
-      <w:pPr>
-        <w:pStyle w:val="BodyText"/>
-        <w:numPr>
-          <w:ilvl w:val="2"/>
-          <w:numId w:val="2"/>
-        </w:numPr>
-        <w:rPr/>
-      </w:pPr>
-      <w:r>
-        <w:rPr/>
-        <w:t>The Google Chrome browser does not seem to install when using these KindWorks installation scripts and the Chocolatey app.  Follow these instructions:</w:t>
-      </w:r>
-    </w:p>
-    <w:p>
-      <w:pPr>
-        <w:pStyle w:val="BodyText"/>
-        <w:numPr>
           <w:ilvl w:val="0"/>
-          <w:numId w:val="10"/>
-        </w:numPr>
-        <w:rPr/>
-      </w:pPr>
-      <w:r>
-        <w:rPr/>
-        <w:t xml:space="preserve">Browse to this website:  </w:t>
-      </w:r>
-      <w:hyperlink r:id="rId7">
-        <w:r>
-          <w:rPr>
-            <w:rStyle w:val="Hyperlink"/>
-          </w:rPr>
-          <w:t>https://www.google.com/chrome</w:t>
-        </w:r>
-      </w:hyperlink>
-    </w:p>
-    <w:p>
-      <w:pPr>
-        <w:pStyle w:val="BodyText"/>
-        <w:numPr>
-          <w:ilvl w:val="0"/>
-          <w:numId w:val="10"/>
-        </w:numPr>
-        <w:rPr/>
-      </w:pPr>
-      <w:r>
-        <w:rPr/>
-        <w:t>Click “Download Chrome”</w:t>
-      </w:r>
-    </w:p>
-    <w:p>
-      <w:pPr>
-        <w:pStyle w:val="BodyText"/>
-        <w:numPr>
-          <w:ilvl w:val="0"/>
-          <w:numId w:val="10"/>
-        </w:numPr>
-        <w:spacing w:before="0" w:after="140"/>
-        <w:rPr/>
-      </w:pPr>
-      <w:r>
-        <w:rPr/>
-        <w:t>Run the Chrome installation file in the C:\Users\User\Downloads folder.</w:t>
-      </w:r>
-    </w:p>
-    <w:p>
-      <w:pPr>
-        <w:pStyle w:val="BodyText"/>
-        <w:spacing w:before="0" w:after="140"/>
+          <w:numId w:val="0"/>
+        </w:numPr>
+        <w:ind w:hanging="0" w:left="0"/>
         <w:rPr/>
       </w:pPr>
       <w:r>
@@ -2637,7 +2572,6 @@
         </w:tabs>
         <w:ind w:left="0" w:hanging="0"/>
       </w:pPr>
-      <w:rPr/>
     </w:lvl>
     <w:lvl w:ilvl="1">
       <w:start w:val="1"/>
@@ -2651,7 +2585,6 @@
         </w:tabs>
         <w:ind w:left="0" w:hanging="0"/>
       </w:pPr>
-      <w:rPr/>
     </w:lvl>
     <w:lvl w:ilvl="2">
       <w:start w:val="1"/>
@@ -2665,7 +2598,6 @@
         </w:tabs>
         <w:ind w:left="0" w:hanging="0"/>
       </w:pPr>
-      <w:rPr/>
     </w:lvl>
     <w:lvl w:ilvl="3">
       <w:start w:val="1"/>
@@ -2679,7 +2611,6 @@
         </w:tabs>
         <w:ind w:left="0" w:hanging="0"/>
       </w:pPr>
-      <w:rPr/>
     </w:lvl>
     <w:lvl w:ilvl="4">
       <w:start w:val="1"/>
@@ -2693,7 +2624,6 @@
         </w:tabs>
         <w:ind w:left="0" w:hanging="0"/>
       </w:pPr>
-      <w:rPr/>
     </w:lvl>
     <w:lvl w:ilvl="5">
       <w:start w:val="1"/>
@@ -2707,7 +2637,6 @@
         </w:tabs>
         <w:ind w:left="0" w:hanging="0"/>
       </w:pPr>
-      <w:rPr/>
     </w:lvl>
     <w:lvl w:ilvl="6">
       <w:start w:val="1"/>
@@ -2721,7 +2650,6 @@
         </w:tabs>
         <w:ind w:left="0" w:hanging="0"/>
       </w:pPr>
-      <w:rPr/>
     </w:lvl>
     <w:lvl w:ilvl="7">
       <w:start w:val="1"/>
@@ -2735,7 +2663,6 @@
         </w:tabs>
         <w:ind w:left="0" w:hanging="0"/>
       </w:pPr>
-      <w:rPr/>
     </w:lvl>
     <w:lvl w:ilvl="8">
       <w:start w:val="1"/>
@@ -2749,12 +2676,139 @@
         </w:tabs>
         <w:ind w:left="0" w:hanging="0"/>
       </w:pPr>
-      <w:rPr/>
     </w:lvl>
   </w:abstractNum>
   <w:abstractNum w:abstractNumId="2">
     <w:lvl w:ilvl="0">
       <w:start w:val="1"/>
+      <w:numFmt w:val="none"/>
+      <w:suff w:val="nothing"/>
+      <w:lvlText w:val=""/>
+      <w:lvlJc w:val="left"/>
+      <w:pPr>
+        <w:tabs>
+          <w:tab w:val="num" w:pos="0"/>
+        </w:tabs>
+        <w:ind w:left="0" w:hanging="0"/>
+      </w:pPr>
+      <w:rPr/>
+    </w:lvl>
+    <w:lvl w:ilvl="1">
+      <w:start w:val="1"/>
+      <w:numFmt w:val="none"/>
+      <w:suff w:val="nothing"/>
+      <w:lvlText w:val=""/>
+      <w:lvlJc w:val="left"/>
+      <w:pPr>
+        <w:tabs>
+          <w:tab w:val="num" w:pos="0"/>
+        </w:tabs>
+        <w:ind w:left="0" w:hanging="0"/>
+      </w:pPr>
+      <w:rPr/>
+    </w:lvl>
+    <w:lvl w:ilvl="2">
+      <w:start w:val="1"/>
+      <w:numFmt w:val="none"/>
+      <w:suff w:val="nothing"/>
+      <w:lvlText w:val=""/>
+      <w:lvlJc w:val="left"/>
+      <w:pPr>
+        <w:tabs>
+          <w:tab w:val="num" w:pos="0"/>
+        </w:tabs>
+        <w:ind w:left="0" w:hanging="0"/>
+      </w:pPr>
+      <w:rPr/>
+    </w:lvl>
+    <w:lvl w:ilvl="3">
+      <w:start w:val="1"/>
+      <w:numFmt w:val="none"/>
+      <w:suff w:val="nothing"/>
+      <w:lvlText w:val=""/>
+      <w:lvlJc w:val="left"/>
+      <w:pPr>
+        <w:tabs>
+          <w:tab w:val="num" w:pos="0"/>
+        </w:tabs>
+        <w:ind w:left="0" w:hanging="0"/>
+      </w:pPr>
+      <w:rPr/>
+    </w:lvl>
+    <w:lvl w:ilvl="4">
+      <w:start w:val="1"/>
+      <w:numFmt w:val="none"/>
+      <w:suff w:val="nothing"/>
+      <w:lvlText w:val=""/>
+      <w:lvlJc w:val="left"/>
+      <w:pPr>
+        <w:tabs>
+          <w:tab w:val="num" w:pos="0"/>
+        </w:tabs>
+        <w:ind w:left="0" w:hanging="0"/>
+      </w:pPr>
+      <w:rPr/>
+    </w:lvl>
+    <w:lvl w:ilvl="5">
+      <w:start w:val="1"/>
+      <w:numFmt w:val="none"/>
+      <w:suff w:val="nothing"/>
+      <w:lvlText w:val=""/>
+      <w:lvlJc w:val="left"/>
+      <w:pPr>
+        <w:tabs>
+          <w:tab w:val="num" w:pos="0"/>
+        </w:tabs>
+        <w:ind w:left="0" w:hanging="0"/>
+      </w:pPr>
+      <w:rPr/>
+    </w:lvl>
+    <w:lvl w:ilvl="6">
+      <w:start w:val="1"/>
+      <w:numFmt w:val="none"/>
+      <w:suff w:val="nothing"/>
+      <w:lvlText w:val=""/>
+      <w:lvlJc w:val="left"/>
+      <w:pPr>
+        <w:tabs>
+          <w:tab w:val="num" w:pos="0"/>
+        </w:tabs>
+        <w:ind w:left="0" w:hanging="0"/>
+      </w:pPr>
+      <w:rPr/>
+    </w:lvl>
+    <w:lvl w:ilvl="7">
+      <w:start w:val="1"/>
+      <w:numFmt w:val="none"/>
+      <w:suff w:val="nothing"/>
+      <w:lvlText w:val=""/>
+      <w:lvlJc w:val="left"/>
+      <w:pPr>
+        <w:tabs>
+          <w:tab w:val="num" w:pos="0"/>
+        </w:tabs>
+        <w:ind w:left="0" w:hanging="0"/>
+      </w:pPr>
+      <w:rPr/>
+    </w:lvl>
+    <w:lvl w:ilvl="8">
+      <w:start w:val="1"/>
+      <w:numFmt w:val="none"/>
+      <w:suff w:val="nothing"/>
+      <w:lvlText w:val=""/>
+      <w:lvlJc w:val="left"/>
+      <w:pPr>
+        <w:tabs>
+          <w:tab w:val="num" w:pos="0"/>
+        </w:tabs>
+        <w:ind w:left="0" w:hanging="0"/>
+      </w:pPr>
+      <w:rPr/>
+    </w:lvl>
+  </w:abstractNum>
+  <w:abstractNum w:abstractNumId="3">
+    <w:lvl w:ilvl="0">
+      <w:start w:val="1"/>
       <w:numFmt w:val="decimal"/>
       <w:suff w:val="nothing"/>
       <w:lvlText w:val="%1)"/>
@@ -2880,7 +2934,7 @@
       <w:rPr/>
     </w:lvl>
   </w:abstractNum>
-  <w:abstractNum w:abstractNumId="3">
+  <w:abstractNum w:abstractNumId="4">
     <w:lvl w:ilvl="0">
       <w:start w:val="1"/>
       <w:numFmt w:val="none"/>
@@ -3008,7 +3062,7 @@
       <w:rPr/>
     </w:lvl>
   </w:abstractNum>
-  <w:abstractNum w:abstractNumId="4">
+  <w:abstractNum w:abstractNumId="5">
     <w:lvl w:ilvl="0">
       <w:start w:val="1"/>
       <w:numFmt w:val="decimal"/>
@@ -3125,143 +3179,6 @@
         <w:ind w:left="3600" w:hanging="360"/>
       </w:pPr>
       <w:rPr/>
-    </w:lvl>
-  </w:abstractNum>
-  <w:abstractNum w:abstractNumId="5">
-    <w:lvl w:ilvl="0">
-      <w:start w:val="1"/>
-      <w:numFmt w:val="bullet"/>
-      <w:lvlText w:val=""/>
-      <w:lvlJc w:val="left"/>
-      <w:pPr>
-        <w:tabs>
-          <w:tab w:val="num" w:pos="720"/>
-        </w:tabs>
-        <w:ind w:left="720" w:hanging="360"/>
-      </w:pPr>
-      <w:rPr>
-        <w:rFonts w:ascii="Symbol" w:hAnsi="Symbol" w:cs="Symbol" w:hint="default"/>
-      </w:rPr>
-    </w:lvl>
-    <w:lvl w:ilvl="1">
-      <w:start w:val="1"/>
-      <w:numFmt w:val="bullet"/>
-      <w:lvlText w:val="◦"/>
-      <w:lvlJc w:val="left"/>
-      <w:pPr>
-        <w:tabs>
-          <w:tab w:val="num" w:pos="1080"/>
-        </w:tabs>
-        <w:ind w:left="1080" w:hanging="360"/>
-      </w:pPr>
-      <w:rPr>
-        <w:rFonts w:ascii="OpenSymbol" w:hAnsi="OpenSymbol" w:cs="OpenSymbol" w:hint="default"/>
-      </w:rPr>
-    </w:lvl>
-    <w:lvl w:ilvl="2">
-      <w:start w:val="1"/>
-      <w:numFmt w:val="bullet"/>
-      <w:lvlText w:val="▪"/>
-      <w:lvlJc w:val="left"/>
-      <w:pPr>
-        <w:tabs>
-          <w:tab w:val="num" w:pos="1440"/>
-        </w:tabs>
-        <w:ind w:left="1440" w:hanging="360"/>
-      </w:pPr>
-      <w:rPr>
-        <w:rFonts w:ascii="OpenSymbol" w:hAnsi="OpenSymbol" w:cs="OpenSymbol" w:hint="default"/>
-      </w:rPr>
-    </w:lvl>
-    <w:lvl w:ilvl="3">
-      <w:start w:val="1"/>
-      <w:numFmt w:val="bullet"/>
-      <w:lvlText w:val=""/>
-      <w:lvlJc w:val="left"/>
-      <w:pPr>
-        <w:tabs>
-          <w:tab w:val="num" w:pos="1800"/>
-        </w:tabs>
-        <w:ind w:left="1800" w:hanging="360"/>
-      </w:pPr>
-      <w:rPr>
-        <w:rFonts w:ascii="Symbol" w:hAnsi="Symbol" w:cs="Symbol" w:hint="default"/>
-      </w:rPr>
-    </w:lvl>
-    <w:lvl w:ilvl="4">
-      <w:start w:val="1"/>
-      <w:numFmt w:val="bullet"/>
-      <w:lvlText w:val="◦"/>
-      <w:lvlJc w:val="left"/>
-      <w:pPr>
-        <w:tabs>
-          <w:tab w:val="num" w:pos="2160"/>
-        </w:tabs>
-        <w:ind w:left="2160" w:hanging="360"/>
-      </w:pPr>
-      <w:rPr>
-        <w:rFonts w:ascii="OpenSymbol" w:hAnsi="OpenSymbol" w:cs="OpenSymbol" w:hint="default"/>
-      </w:rPr>
-    </w:lvl>
-    <w:lvl w:ilvl="5">
-      <w:start w:val="1"/>
-      <w:numFmt w:val="bullet"/>
-      <w:lvlText w:val="▪"/>
-      <w:lvlJc w:val="left"/>
-      <w:pPr>
-        <w:tabs>
-          <w:tab w:val="num" w:pos="2520"/>
-        </w:tabs>
-        <w:ind w:left="2520" w:hanging="360"/>
-      </w:pPr>
-      <w:rPr>
-        <w:rFonts w:ascii="OpenSymbol" w:hAnsi="OpenSymbol" w:cs="OpenSymbol" w:hint="default"/>
-      </w:rPr>
-    </w:lvl>
-    <w:lvl w:ilvl="6">
-      <w:start w:val="1"/>
-      <w:numFmt w:val="bullet"/>
-      <w:lvlText w:val=""/>
-      <w:lvlJc w:val="left"/>
-      <w:pPr>
-        <w:tabs>
-          <w:tab w:val="num" w:pos="2880"/>
-        </w:tabs>
-        <w:ind w:left="2880" w:hanging="360"/>
-      </w:pPr>
-      <w:rPr>
-        <w:rFonts w:ascii="Symbol" w:hAnsi="Symbol" w:cs="Symbol" w:hint="default"/>
-      </w:rPr>
-    </w:lvl>
-    <w:lvl w:ilvl="7">
-      <w:start w:val="1"/>
-      <w:numFmt w:val="bullet"/>
-      <w:lvlText w:val="◦"/>
-      <w:lvlJc w:val="left"/>
-      <w:pPr>
-        <w:tabs>
-          <w:tab w:val="num" w:pos="3240"/>
-        </w:tabs>
-        <w:ind w:left="3240" w:hanging="360"/>
-      </w:pPr>
-      <w:rPr>
-        <w:rFonts w:ascii="OpenSymbol" w:hAnsi="OpenSymbol" w:cs="OpenSymbol" w:hint="default"/>
-      </w:rPr>
-    </w:lvl>
-    <w:lvl w:ilvl="8">
-      <w:start w:val="1"/>
-      <w:numFmt w:val="bullet"/>
-      <w:lvlText w:val="▪"/>
-      <w:lvlJc w:val="left"/>
-      <w:pPr>
-        <w:tabs>
-          <w:tab w:val="num" w:pos="3600"/>
-        </w:tabs>
-        <w:ind w:left="3600" w:hanging="360"/>
-      </w:pPr>
-      <w:rPr>
-        <w:rFonts w:ascii="OpenSymbol" w:hAnsi="OpenSymbol" w:cs="OpenSymbol" w:hint="default"/>
-      </w:rPr>
     </w:lvl>
   </w:abstractNum>
   <w:abstractNum w:abstractNumId="6">
@@ -3678,8 +3595,8 @@
   <w:abstractNum w:abstractNumId="9">
     <w:lvl w:ilvl="0">
       <w:start w:val="1"/>
-      <w:numFmt w:val="decimal"/>
-      <w:lvlText w:val="%1)"/>
+      <w:numFmt w:val="bullet"/>
+      <w:lvlText w:val=""/>
       <w:lvlJc w:val="left"/>
       <w:pPr>
         <w:tabs>
@@ -3687,12 +3604,14 @@
         </w:tabs>
         <w:ind w:left="720" w:hanging="360"/>
       </w:pPr>
-      <w:rPr/>
+      <w:rPr>
+        <w:rFonts w:ascii="Symbol" w:hAnsi="Symbol" w:cs="Symbol" w:hint="default"/>
+      </w:rPr>
     </w:lvl>
     <w:lvl w:ilvl="1">
       <w:start w:val="1"/>
-      <w:numFmt w:val="decimal"/>
-      <w:lvlText w:val="%2)"/>
+      <w:numFmt w:val="bullet"/>
+      <w:lvlText w:val="◦"/>
       <w:lvlJc w:val="left"/>
       <w:pPr>
         <w:tabs>
@@ -3700,12 +3619,14 @@
         </w:tabs>
         <w:ind w:left="1080" w:hanging="360"/>
       </w:pPr>
-      <w:rPr/>
+      <w:rPr>
+        <w:rFonts w:ascii="OpenSymbol" w:hAnsi="OpenSymbol" w:cs="OpenSymbol" w:hint="default"/>
+      </w:rPr>
     </w:lvl>
     <w:lvl w:ilvl="2">
       <w:start w:val="1"/>
-      <w:numFmt w:val="decimal"/>
-      <w:lvlText w:val="%3)"/>
+      <w:numFmt w:val="bullet"/>
+      <w:lvlText w:val="▪"/>
       <w:lvlJc w:val="left"/>
       <w:pPr>
         <w:tabs>
@@ -3713,12 +3634,14 @@
         </w:tabs>
         <w:ind w:left="1440" w:hanging="360"/>
       </w:pPr>
-      <w:rPr/>
+      <w:rPr>
+        <w:rFonts w:ascii="OpenSymbol" w:hAnsi="OpenSymbol" w:cs="OpenSymbol" w:hint="default"/>
+      </w:rPr>
     </w:lvl>
     <w:lvl w:ilvl="3">
       <w:start w:val="1"/>
-      <w:numFmt w:val="decimal"/>
-      <w:lvlText w:val="%4)"/>
+      <w:numFmt w:val="bullet"/>
+      <w:lvlText w:val=""/>
       <w:lvlJc w:val="left"/>
       <w:pPr>
         <w:tabs>
@@ -3726,12 +3649,14 @@
         </w:tabs>
         <w:ind w:left="1800" w:hanging="360"/>
       </w:pPr>
-      <w:rPr/>
+      <w:rPr>
+        <w:rFonts w:ascii="Symbol" w:hAnsi="Symbol" w:cs="Symbol" w:hint="default"/>
+      </w:rPr>
     </w:lvl>
     <w:lvl w:ilvl="4">
       <w:start w:val="1"/>
-      <w:numFmt w:val="decimal"/>
-      <w:lvlText w:val="%5)"/>
+      <w:numFmt w:val="bullet"/>
+      <w:lvlText w:val="◦"/>
       <w:lvlJc w:val="left"/>
       <w:pPr>
         <w:tabs>
@@ -3739,12 +3664,14 @@
         </w:tabs>
         <w:ind w:left="2160" w:hanging="360"/>
       </w:pPr>
-      <w:rPr/>
+      <w:rPr>
+        <w:rFonts w:ascii="OpenSymbol" w:hAnsi="OpenSymbol" w:cs="OpenSymbol" w:hint="default"/>
+      </w:rPr>
     </w:lvl>
     <w:lvl w:ilvl="5">
       <w:start w:val="1"/>
-      <w:numFmt w:val="decimal"/>
-      <w:lvlText w:val="%6)"/>
+      <w:numFmt w:val="bullet"/>
+      <w:lvlText w:val="▪"/>
       <w:lvlJc w:val="left"/>
       <w:pPr>
         <w:tabs>
@@ -3752,12 +3679,14 @@
         </w:tabs>
         <w:ind w:left="2520" w:hanging="360"/>
       </w:pPr>
-      <w:rPr/>
+      <w:rPr>
+        <w:rFonts w:ascii="OpenSymbol" w:hAnsi="OpenSymbol" w:cs="OpenSymbol" w:hint="default"/>
+      </w:rPr>
     </w:lvl>
     <w:lvl w:ilvl="6">
       <w:start w:val="1"/>
-      <w:numFmt w:val="decimal"/>
-      <w:lvlText w:val="%7)"/>
+      <w:numFmt w:val="bullet"/>
+      <w:lvlText w:val=""/>
       <w:lvlJc w:val="left"/>
       <w:pPr>
         <w:tabs>
@@ -3765,12 +3694,14 @@
         </w:tabs>
         <w:ind w:left="2880" w:hanging="360"/>
       </w:pPr>
-      <w:rPr/>
+      <w:rPr>
+        <w:rFonts w:ascii="Symbol" w:hAnsi="Symbol" w:cs="Symbol" w:hint="default"/>
+      </w:rPr>
     </w:lvl>
     <w:lvl w:ilvl="7">
       <w:start w:val="1"/>
-      <w:numFmt w:val="decimal"/>
-      <w:lvlText w:val="%8)"/>
+      <w:numFmt w:val="bullet"/>
+      <w:lvlText w:val="◦"/>
       <w:lvlJc w:val="left"/>
       <w:pPr>
         <w:tabs>
@@ -3778,12 +3709,14 @@
         </w:tabs>
         <w:ind w:left="3240" w:hanging="360"/>
       </w:pPr>
-      <w:rPr/>
+      <w:rPr>
+        <w:rFonts w:ascii="OpenSymbol" w:hAnsi="OpenSymbol" w:cs="OpenSymbol" w:hint="default"/>
+      </w:rPr>
     </w:lvl>
     <w:lvl w:ilvl="8">
       <w:start w:val="1"/>
-      <w:numFmt w:val="decimal"/>
-      <w:lvlText w:val="%9)"/>
+      <w:numFmt w:val="bullet"/>
+      <w:lvlText w:val="▪"/>
       <w:lvlJc w:val="left"/>
       <w:pPr>
         <w:tabs>
@@ -3791,7 +3724,9 @@
         </w:tabs>
         <w:ind w:left="3600" w:hanging="360"/>
       </w:pPr>
-      <w:rPr/>
+      <w:rPr>
+        <w:rFonts w:ascii="OpenSymbol" w:hAnsi="OpenSymbol" w:cs="OpenSymbol" w:hint="default"/>
+      </w:rPr>
     </w:lvl>
   </w:abstractNum>
   <w:abstractNum w:abstractNumId="10">
@@ -4304,125 +4239,6 @@
         <w:ind w:left="3600" w:hanging="360"/>
       </w:pPr>
       <w:rPr/>
-    </w:lvl>
-  </w:abstractNum>
-  <w:abstractNum w:abstractNumId="14">
-    <w:lvl w:ilvl="0">
-      <w:start w:val="1"/>
-      <w:numFmt w:val="none"/>
-      <w:suff w:val="nothing"/>
-      <w:lvlText w:val=""/>
-      <w:lvlJc w:val="left"/>
-      <w:pPr>
-        <w:tabs>
-          <w:tab w:val="num" w:pos="0"/>
-        </w:tabs>
-        <w:ind w:left="0" w:hanging="0"/>
-      </w:pPr>
-    </w:lvl>
-    <w:lvl w:ilvl="1">
-      <w:start w:val="1"/>
-      <w:numFmt w:val="none"/>
-      <w:suff w:val="nothing"/>
-      <w:lvlText w:val=""/>
-      <w:lvlJc w:val="left"/>
-      <w:pPr>
-        <w:tabs>
-          <w:tab w:val="num" w:pos="0"/>
-        </w:tabs>
-        <w:ind w:left="0" w:hanging="0"/>
-      </w:pPr>
-    </w:lvl>
-    <w:lvl w:ilvl="2">
-      <w:start w:val="1"/>
-      <w:numFmt w:val="none"/>
-      <w:suff w:val="nothing"/>
-      <w:lvlText w:val=""/>
-      <w:lvlJc w:val="left"/>
-      <w:pPr>
-        <w:tabs>
-          <w:tab w:val="num" w:pos="0"/>
-        </w:tabs>
-        <w:ind w:left="0" w:hanging="0"/>
-      </w:pPr>
-    </w:lvl>
-    <w:lvl w:ilvl="3">
-      <w:start w:val="1"/>
-      <w:numFmt w:val="none"/>
-      <w:suff w:val="nothing"/>
-      <w:lvlText w:val=""/>
-      <w:lvlJc w:val="left"/>
-      <w:pPr>
-        <w:tabs>
-          <w:tab w:val="num" w:pos="0"/>
-        </w:tabs>
-        <w:ind w:left="0" w:hanging="0"/>
-      </w:pPr>
-    </w:lvl>
-    <w:lvl w:ilvl="4">
-      <w:start w:val="1"/>
-      <w:numFmt w:val="none"/>
-      <w:suff w:val="nothing"/>
-      <w:lvlText w:val=""/>
-      <w:lvlJc w:val="left"/>
-      <w:pPr>
-        <w:tabs>
-          <w:tab w:val="num" w:pos="0"/>
-        </w:tabs>
-        <w:ind w:left="0" w:hanging="0"/>
-      </w:pPr>
-    </w:lvl>
-    <w:lvl w:ilvl="5">
-      <w:start w:val="1"/>
-      <w:numFmt w:val="none"/>
-      <w:suff w:val="nothing"/>
-      <w:lvlText w:val=""/>
-      <w:lvlJc w:val="left"/>
-      <w:pPr>
-        <w:tabs>
-          <w:tab w:val="num" w:pos="0"/>
-        </w:tabs>
-        <w:ind w:left="0" w:hanging="0"/>
-      </w:pPr>
-    </w:lvl>
-    <w:lvl w:ilvl="6">
-      <w:start w:val="1"/>
-      <w:numFmt w:val="none"/>
-      <w:suff w:val="nothing"/>
-      <w:lvlText w:val=""/>
-      <w:lvlJc w:val="left"/>
-      <w:pPr>
-        <w:tabs>
-          <w:tab w:val="num" w:pos="0"/>
-        </w:tabs>
-        <w:ind w:left="0" w:hanging="0"/>
-      </w:pPr>
-    </w:lvl>
-    <w:lvl w:ilvl="7">
-      <w:start w:val="1"/>
-      <w:numFmt w:val="none"/>
-      <w:suff w:val="nothing"/>
-      <w:lvlText w:val=""/>
-      <w:lvlJc w:val="left"/>
-      <w:pPr>
-        <w:tabs>
-          <w:tab w:val="num" w:pos="0"/>
-        </w:tabs>
-        <w:ind w:left="0" w:hanging="0"/>
-      </w:pPr>
-    </w:lvl>
-    <w:lvl w:ilvl="8">
-      <w:start w:val="1"/>
-      <w:numFmt w:val="none"/>
-      <w:suff w:val="nothing"/>
-      <w:lvlText w:val=""/>
-      <w:lvlJc w:val="left"/>
-      <w:pPr>
-        <w:tabs>
-          <w:tab w:val="num" w:pos="0"/>
-        </w:tabs>
-        <w:ind w:left="0" w:hanging="0"/>
-      </w:pPr>
     </w:lvl>
   </w:abstractNum>
   <w:num w:numId="1">
@@ -4465,10 +4281,7 @@
     <w:abstractNumId w:val="13"/>
   </w:num>
   <w:num w:numId="14">
-    <w:abstractNumId w:val="14"/>
-  </w:num>
-  <w:num w:numId="15">
-    <w:abstractNumId w:val="4"/>
+    <w:abstractNumId w:val="5"/>
     <w:lvlOverride w:ilvl="0">
       <w:startOverride w:val="1"/>
     </w:lvlOverride>
@@ -4521,7 +4334,7 @@
     <w:pPr>
       <w:numPr>
         <w:ilvl w:val="0"/>
-        <w:numId w:val="1"/>
+        <w:numId w:val="2"/>
       </w:numPr>
       <w:spacing w:before="240" w:after="120"/>
       <w:outlineLvl w:val="0"/>
@@ -4541,7 +4354,7 @@
     <w:pPr>
       <w:numPr>
         <w:ilvl w:val="1"/>
-        <w:numId w:val="3"/>
+        <w:numId w:val="4"/>
       </w:numPr>
       <w:spacing w:before="200" w:after="120"/>
       <w:outlineLvl w:val="1"/>
@@ -4561,7 +4374,7 @@
     <w:pPr>
       <w:numPr>
         <w:ilvl w:val="2"/>
-        <w:numId w:val="2"/>
+        <w:numId w:val="3"/>
       </w:numPr>
       <w:spacing w:before="140" w:after="120"/>
       <w:outlineLvl w:val="2"/>
@@ -4578,8 +4391,8 @@
     <w:qFormat/>
     <w:rPr/>
   </w:style>
-  <w:style w:type="character" w:styleId="Bullets">
-    <w:name w:val="Bullets"/>
+  <w:style w:type="character" w:styleId="Bulletsuser">
+    <w:name w:val="Bullets (user)"/>
     <w:qFormat/>
     <w:rPr>
       <w:rFonts w:ascii="OpenSymbol" w:hAnsi="OpenSymbol" w:eastAsia="OpenSymbol" w:cs="OpenSymbol"/>
@@ -4599,8 +4412,8 @@
       <w:u w:val="single"/>
     </w:rPr>
   </w:style>
-  <w:style w:type="character" w:styleId="Bulletsuser">
-    <w:name w:val="Bullets (user)"/>
+  <w:style w:type="character" w:styleId="Bullets">
+    <w:name w:val="Bullets"/>
     <w:qFormat/>
     <w:rPr>
       <w:rFonts w:ascii="OpenSymbol" w:hAnsi="OpenSymbol" w:eastAsia="OpenSymbol" w:cs="OpenSymbol"/>
@@ -4690,37 +4503,37 @@
         <a:srgbClr val="000000"/>
       </a:dk1>
       <a:lt1>
-        <a:srgbClr val="FFFFFF"/>
+        <a:srgbClr val="ffffff"/>
       </a:lt1>
       <a:dk2>
         <a:srgbClr val="000000"/>
       </a:dk2>
       <a:lt2>
-        <a:srgbClr val="FFFFFF"/>
+        <a:srgbClr val="ffffff"/>
       </a:lt2>
       <a:accent1>
-        <a:srgbClr val="18A303"/>
+        <a:srgbClr val="18a303"/>
       </a:accent1>
       <a:accent2>
-        <a:srgbClr val="0369A3"/>
+        <a:srgbClr val="0369a3"/>
       </a:accent2>
       <a:accent3>
-        <a:srgbClr val="A33E03"/>
+        <a:srgbClr val="a33e03"/>
       </a:accent3>
       <a:accent4>
-        <a:srgbClr val="8E03A3"/>
+        <a:srgbClr val="8e03a3"/>
       </a:accent4>
       <a:accent5>
-        <a:srgbClr val="C99C00"/>
+        <a:srgbClr val="c99c00"/>
       </a:accent5>
       <a:accent6>
-        <a:srgbClr val="C9211E"/>
+        <a:srgbClr val="c9211e"/>
       </a:accent6>
       <a:hlink>
-        <a:srgbClr val="0000EE"/>
+        <a:srgbClr val="0000ee"/>
       </a:hlink>
       <a:folHlink>
-        <a:srgbClr val="551A8B"/>
+        <a:srgbClr val="551a8b"/>
       </a:folHlink>
     </a:clrScheme>
     <a:fontScheme name="Office">

</xml_diff>

<commit_message>
minor rearrangements of text
Per 9/20/206 meeting, rearranged text to make it easier for refurbishers to understand how to download the latest PowerShell scripts, and then use them.  Also moved the descriptions of all of the scripts to the end of the document.
</commit_message>
<xml_diff>
--- a/PowerShellScriptsAdam/Adams_PowerShell_Script_Instructions.docx
+++ b/PowerShellScriptsAdam/Adams_PowerShell_Script_Instructions.docx
@@ -96,21 +96,7 @@
           <w:sz w:val="36"/>
           <w:szCs w:val="36"/>
         </w:rPr>
-        <w:t xml:space="preserve">Updated </w:t>
-      </w:r>
-      <w:r>
-        <w:rPr>
-          <w:sz w:val="36"/>
-          <w:szCs w:val="36"/>
-        </w:rPr>
-        <w:t>September</w:t>
-      </w:r>
-      <w:r>
-        <w:rPr>
-          <w:sz w:val="36"/>
-          <w:szCs w:val="36"/>
-        </w:rPr>
-        <w:t xml:space="preserve"> 2026</w:t>
+        <w:t>Updated September 2026</w:t>
       </w:r>
     </w:p>
     <w:p>
@@ -156,440 +142,66 @@
       </w:pPr>
       <w:r>
         <w:rPr/>
-        <w:t>For the instructions on how to use these scripts, you can skip to the “</w:t>
-      </w:r>
-      <w:hyperlink w:anchor="_toc47">
-        <w:r>
-          <w:rPr>
-            <w:rStyle w:val="Hyperlink"/>
-          </w:rPr>
-          <w:t>Instructions</w:t>
-        </w:r>
-      </w:hyperlink>
-      <w:r>
-        <w:rPr/>
-        <w:t>” section in this document.</w:t>
-      </w:r>
-    </w:p>
-    <w:p>
-      <w:pPr>
-        <w:pStyle w:val="Normal"/>
-        <w:bidi w:val="0"/>
-        <w:jc w:val="left"/>
-        <w:rPr/>
-      </w:pPr>
-      <w:r>
-        <w:rPr/>
-      </w:r>
-    </w:p>
-    <w:p>
-      <w:pPr>
-        <w:pStyle w:val="Normal"/>
-        <w:bidi w:val="0"/>
-        <w:jc w:val="left"/>
+      </w:r>
+    </w:p>
+    <w:p>
+      <w:pPr>
+        <w:pStyle w:val="Heading1"/>
+        <w:numPr>
+          <w:ilvl w:val="0"/>
+          <w:numId w:val="2"/>
+        </w:numPr>
+        <w:ind w:hanging="0" w:left="0"/>
+        <w:rPr/>
+      </w:pPr>
+      <w:bookmarkStart w:id="0" w:name="_toc47"/>
+      <w:bookmarkEnd w:id="0"/>
+      <w:r>
+        <w:rPr/>
+        <w:t>Instructions</w:t>
+      </w:r>
+    </w:p>
+    <w:p>
+      <w:pPr>
+        <w:pStyle w:val="BodyText"/>
+        <w:ind w:hanging="0" w:left="0"/>
+        <w:rPr/>
+      </w:pPr>
+      <w:r>
+        <w:rPr/>
+        <w:t>These instructions tell refurbishers how to download and use custom PowerShell scripts for downloading, installing and configuring all of the Windows applications that refurbishers are expected to install on a Kindworks computer.</w:t>
+      </w:r>
+    </w:p>
+    <w:p>
+      <w:pPr>
+        <w:pStyle w:val="BodyText"/>
+        <w:ind w:hanging="0" w:left="0"/>
+        <w:rPr/>
+      </w:pPr>
+      <w:r>
+        <w:rPr/>
+      </w:r>
+    </w:p>
+    <w:p>
+      <w:pPr>
+        <w:pStyle w:val="BodyText"/>
+        <w:ind w:hanging="0" w:left="0"/>
+        <w:rPr/>
+      </w:pPr>
+      <w:r>
+        <w:rPr/>
+        <w:t xml:space="preserve">The following instructions should be followed </w:t>
+      </w:r>
+      <w:r>
         <w:rPr>
           <w:b/>
           <w:bCs/>
         </w:rPr>
-      </w:pPr>
-      <w:r>
-        <w:rPr>
-          <w:b/>
-          <w:bCs/>
-        </w:rPr>
-        <w:t>This document assumes that the user has downloaded all of the below listed scripts onto an external drive of some sort.</w:t>
-      </w:r>
-    </w:p>
-    <w:p>
-      <w:pPr>
-        <w:pStyle w:val="Normal"/>
-        <w:bidi w:val="0"/>
-        <w:jc w:val="left"/>
-        <w:rPr/>
-      </w:pPr>
-      <w:r>
-        <w:rPr/>
-      </w:r>
-    </w:p>
-    <w:p>
-      <w:pPr>
-        <w:pStyle w:val="Heading1"/>
-        <w:numPr>
-          <w:ilvl w:val="0"/>
-          <w:numId w:val="2"/>
-        </w:numPr>
-        <w:ind w:hanging="0" w:left="0"/>
-        <w:rPr/>
-      </w:pPr>
-      <w:bookmarkStart w:id="0" w:name="_toc26"/>
-      <w:bookmarkEnd w:id="0"/>
-      <w:r>
-        <w:rPr/>
-        <w:t>Brief Script Descriptions</w:t>
-      </w:r>
-    </w:p>
-    <w:p>
-      <w:pPr>
-        <w:pStyle w:val="Normal"/>
-        <w:bidi w:val="0"/>
-        <w:jc w:val="left"/>
-        <w:rPr/>
-      </w:pPr>
-      <w:r>
-        <w:rPr/>
-        <w:t xml:space="preserve">Below are quick descriptions of each script.  </w:t>
-      </w:r>
-    </w:p>
-    <w:p>
-      <w:pPr>
-        <w:pStyle w:val="Heading2"/>
-        <w:numPr>
-          <w:ilvl w:val="0"/>
-          <w:numId w:val="0"/>
-        </w:numPr>
-        <w:bidi w:val="0"/>
-        <w:ind w:hanging="0" w:left="0"/>
-        <w:jc w:val="left"/>
-        <w:rPr/>
-      </w:pPr>
-      <w:r>
-        <w:rPr/>
-      </w:r>
-    </w:p>
-    <w:p>
-      <w:pPr>
-        <w:pStyle w:val="Heading2"/>
-        <w:keepNext w:val="true"/>
-        <w:widowControl/>
-        <w:numPr>
-          <w:ilvl w:val="1"/>
-          <w:numId w:val="4"/>
-        </w:numPr>
-        <w:suppressAutoHyphens w:val="true"/>
-        <w:bidi w:val="0"/>
-        <w:ind w:hanging="0" w:left="0"/>
-        <w:jc w:val="left"/>
-        <w:rPr>
-          <w:rFonts w:ascii="Liberation Sans" w:hAnsi="Liberation Sans" w:eastAsia="Microsoft YaHei" w:cs="Arial"/>
-          <w:color w:val="auto"/>
-          <w:kern w:val="2"/>
-          <w:lang w:val="en-US" w:eastAsia="zh-CN" w:bidi="hi-IN"/>
-        </w:rPr>
-      </w:pPr>
-      <w:r>
-        <w:rPr>
-          <w:rFonts w:eastAsia="Microsoft YaHei" w:cs="Arial"/>
-          <w:color w:val="auto"/>
-          <w:kern w:val="2"/>
-          <w:lang w:val="en-US" w:eastAsia="zh-CN" w:bidi="hi-IN"/>
-        </w:rPr>
-        <w:t>Bootup Bypass Script.cmd</w:t>
-      </w:r>
-    </w:p>
-    <w:p>
-      <w:pPr>
-        <w:pStyle w:val="Normal"/>
-        <w:bidi w:val="0"/>
-        <w:jc w:val="left"/>
-        <w:rPr/>
-      </w:pPr>
-      <w:r>
-        <w:rPr/>
-        <w:t xml:space="preserve">The purpose of this command prompt script is to launch the Initialize Script.ps1 script in a PowerShell window with the proper administrative credentials needed to run unsigned PowerShell scripts in Windows.  When launched, it will prompt the user to click OK to elevate privileges, which is done on purpose, by design.  Otherwise, a fresh copy of Windows will not allow a new user to run unsigned PowerShell scripts by policy.  This script also copies the necessary files over to the </w:t>
-      </w:r>
-      <w:r>
-        <w:rPr>
-          <w:b w:val="false"/>
-          <w:bCs w:val="false"/>
-        </w:rPr>
-        <w:t>C:\</w:t>
-      </w:r>
-      <w:hyperlink r:id="rId2">
-        <w:r>
-          <w:rPr>
-            <w:rStyle w:val="Hyperlink"/>
-            <w:b w:val="false"/>
-            <w:bCs w:val="false"/>
-          </w:rPr>
-          <w:t>KindworksScripts</w:t>
-        </w:r>
-      </w:hyperlink>
-      <w:r>
-        <w:rPr>
-          <w:b w:val="false"/>
-          <w:bCs w:val="false"/>
-        </w:rPr>
-        <w:t xml:space="preserve"> folder in order to facilitate future use.</w:t>
-      </w:r>
-    </w:p>
-    <w:p>
-      <w:pPr>
-        <w:pStyle w:val="Heading2"/>
-        <w:numPr>
-          <w:ilvl w:val="1"/>
-          <w:numId w:val="4"/>
-        </w:numPr>
-        <w:bidi w:val="0"/>
-        <w:ind w:hanging="0" w:left="0"/>
-        <w:jc w:val="left"/>
-        <w:rPr/>
-      </w:pPr>
-      <w:r>
-        <w:rPr/>
-      </w:r>
-    </w:p>
-    <w:p>
-      <w:pPr>
-        <w:pStyle w:val="Heading2"/>
-        <w:numPr>
-          <w:ilvl w:val="1"/>
-          <w:numId w:val="4"/>
-        </w:numPr>
-        <w:bidi w:val="0"/>
-        <w:ind w:hanging="0" w:left="0"/>
-        <w:jc w:val="left"/>
-        <w:rPr/>
-      </w:pPr>
-      <w:r>
-        <w:rPr/>
-        <w:t>Initialize Script.ps1</w:t>
-      </w:r>
-    </w:p>
-    <w:p>
-      <w:pPr>
-        <w:pStyle w:val="Normal"/>
-        <w:bidi w:val="0"/>
-        <w:jc w:val="left"/>
-        <w:rPr/>
-      </w:pPr>
-      <w:r>
-        <w:rPr/>
-        <w:t>This script should be used on a computer that has just had its operating system installed fresh.  The purpose of this script is to perform a bunch of one-time preparation tasks.  The script will then install a series of applications, and will place shortcuts to those applications in folders on the user’s desktop.</w:t>
-      </w:r>
-    </w:p>
-    <w:p>
-      <w:pPr>
-        <w:pStyle w:val="Normal"/>
-        <w:bidi w:val="0"/>
-        <w:jc w:val="left"/>
-        <w:rPr/>
-      </w:pPr>
-      <w:r>
-        <w:rPr/>
-      </w:r>
-    </w:p>
-    <w:p>
-      <w:pPr>
-        <w:pStyle w:val="Heading2"/>
-        <w:keepNext w:val="true"/>
-        <w:widowControl/>
-        <w:numPr>
-          <w:ilvl w:val="1"/>
-          <w:numId w:val="4"/>
-        </w:numPr>
-        <w:suppressAutoHyphens w:val="true"/>
-        <w:bidi w:val="0"/>
-        <w:ind w:hanging="0" w:left="0"/>
-        <w:jc w:val="left"/>
-        <w:rPr>
-          <w:rFonts w:ascii="Liberation Sans" w:hAnsi="Liberation Sans" w:eastAsia="Microsoft YaHei" w:cs="Arial"/>
-          <w:color w:val="auto"/>
-          <w:kern w:val="2"/>
-          <w:lang w:val="en-US" w:eastAsia="zh-CN" w:bidi="hi-IN"/>
-        </w:rPr>
-      </w:pPr>
-      <w:r>
-        <w:rPr>
-          <w:rFonts w:eastAsia="Microsoft YaHei" w:cs="Arial"/>
-          <w:color w:val="auto"/>
-          <w:kern w:val="2"/>
-          <w:lang w:val="en-US" w:eastAsia="zh-CN" w:bidi="hi-IN"/>
-        </w:rPr>
-        <w:t>Update Apps.cmd</w:t>
-      </w:r>
-    </w:p>
-    <w:p>
-      <w:pPr>
-        <w:pStyle w:val="Normal"/>
-        <w:bidi w:val="0"/>
-        <w:jc w:val="left"/>
-        <w:rPr/>
-      </w:pPr>
-      <w:r>
-        <w:rPr/>
-        <w:t>The purpose of this command prompt script is to launch the Update Apps.ps1 script in a PowerShell window with the proper administrative credentials needed to run unsigned PowerShell scripts in Windows.  When launched, it will prompt the user to click OK to elevate privileges, which is done on purpose, by design.  Otherwise, a fresh copy of Windows will not allow a new user to run unsigned PowerShell scripts by policy.</w:t>
-      </w:r>
-    </w:p>
-    <w:p>
-      <w:pPr>
-        <w:pStyle w:val="BodyText"/>
-        <w:widowControl/>
-        <w:numPr>
-          <w:ilvl w:val="0"/>
-          <w:numId w:val="0"/>
-        </w:numPr>
-        <w:suppressAutoHyphens w:val="true"/>
-        <w:bidi w:val="0"/>
-        <w:ind w:hanging="0" w:left="0"/>
-        <w:jc w:val="left"/>
-        <w:rPr>
-          <w:rFonts w:ascii="Liberation Sans" w:hAnsi="Liberation Sans" w:eastAsia="Microsoft YaHei" w:cs="Arial"/>
-          <w:color w:val="auto"/>
-          <w:kern w:val="2"/>
-          <w:lang w:val="en-US" w:eastAsia="zh-CN" w:bidi="hi-IN"/>
-        </w:rPr>
-      </w:pPr>
-      <w:r>
-        <w:rPr>
-          <w:rFonts w:eastAsia="Microsoft YaHei" w:cs="Arial" w:ascii="Liberation Sans" w:hAnsi="Liberation Sans"/>
-          <w:color w:val="auto"/>
-          <w:kern w:val="2"/>
-          <w:lang w:val="en-US" w:eastAsia="zh-CN" w:bidi="hi-IN"/>
-        </w:rPr>
-      </w:r>
-    </w:p>
-    <w:p>
-      <w:pPr>
-        <w:pStyle w:val="Heading2"/>
-        <w:keepNext w:val="true"/>
-        <w:widowControl/>
-        <w:numPr>
-          <w:ilvl w:val="1"/>
-          <w:numId w:val="4"/>
-        </w:numPr>
-        <w:suppressAutoHyphens w:val="true"/>
-        <w:bidi w:val="0"/>
-        <w:ind w:hanging="0" w:left="0"/>
-        <w:jc w:val="left"/>
-        <w:rPr>
-          <w:rFonts w:ascii="Liberation Sans" w:hAnsi="Liberation Sans" w:eastAsia="Microsoft YaHei" w:cs="Arial"/>
-          <w:color w:val="auto"/>
-          <w:kern w:val="2"/>
-          <w:lang w:val="en-US" w:eastAsia="zh-CN" w:bidi="hi-IN"/>
-        </w:rPr>
-      </w:pPr>
-      <w:r>
-        <w:rPr>
-          <w:rFonts w:eastAsia="Microsoft YaHei" w:cs="Arial"/>
-          <w:color w:val="auto"/>
-          <w:kern w:val="2"/>
-          <w:lang w:val="en-US" w:eastAsia="zh-CN" w:bidi="hi-IN"/>
-        </w:rPr>
-        <w:t>Update Apps.ps1</w:t>
-      </w:r>
-    </w:p>
-    <w:p>
-      <w:pPr>
-        <w:pStyle w:val="Normal"/>
-        <w:bidi w:val="0"/>
-        <w:jc w:val="left"/>
-        <w:rPr/>
-      </w:pPr>
-      <w:r>
-        <w:rPr/>
-        <w:t>The purpose of this script is to update all of the applications that KindWorks installed on the refurbished computer.  The value of this script is that, once launched, it updates multiple applications, saving the user significant time.  This relies on the Chocolately application to update the applications.</w:t>
-      </w:r>
-    </w:p>
-    <w:p>
-      <w:pPr>
-        <w:pStyle w:val="Normal"/>
-        <w:bidi w:val="0"/>
-        <w:jc w:val="left"/>
-        <w:rPr/>
-      </w:pPr>
-      <w:r>
-        <w:rPr/>
-      </w:r>
-    </w:p>
-    <w:p>
-      <w:pPr>
-        <w:pStyle w:val="Heading2"/>
-        <w:keepNext w:val="true"/>
-        <w:widowControl/>
-        <w:numPr>
-          <w:ilvl w:val="0"/>
-          <w:numId w:val="0"/>
-        </w:numPr>
-        <w:suppressAutoHyphens w:val="true"/>
-        <w:bidi w:val="0"/>
-        <w:ind w:hanging="0" w:left="0"/>
-        <w:jc w:val="left"/>
-        <w:rPr>
-          <w:rFonts w:ascii="Liberation Sans" w:hAnsi="Liberation Sans" w:eastAsia="Microsoft YaHei" w:cs="Arial"/>
-          <w:color w:val="auto"/>
-          <w:kern w:val="2"/>
-          <w:lang w:val="en-US" w:eastAsia="zh-CN" w:bidi="hi-IN"/>
-        </w:rPr>
-      </w:pPr>
-      <w:r>
-        <w:rPr>
-          <w:rFonts w:eastAsia="Microsoft YaHei" w:cs="Arial"/>
-          <w:color w:val="auto"/>
-          <w:kern w:val="2"/>
-          <w:lang w:val="en-US" w:eastAsia="zh-CN" w:bidi="hi-IN"/>
-        </w:rPr>
-        <w:t>KindWorks.pow</w:t>
-      </w:r>
-    </w:p>
-    <w:p>
-      <w:pPr>
-        <w:pStyle w:val="Normal"/>
-        <w:bidi w:val="0"/>
-        <w:jc w:val="left"/>
-        <w:rPr/>
-      </w:pPr>
-      <w:r>
-        <w:rPr/>
-        <w:t xml:space="preserve">This is a “power plan” configuration file for Windows.  It is a collection of hardware and system settings that manages how the computer uses power.  This files uses standard settings that KindWorks has used for a long time.  </w:t>
-      </w:r>
-    </w:p>
-    <w:p>
-      <w:pPr>
-        <w:pStyle w:val="Normal"/>
-        <w:bidi w:val="0"/>
-        <w:jc w:val="left"/>
-        <w:rPr/>
-      </w:pPr>
-      <w:r>
-        <w:rPr/>
-      </w:r>
-    </w:p>
-    <w:p>
-      <w:pPr>
-        <w:pStyle w:val="Heading1"/>
-        <w:numPr>
-          <w:ilvl w:val="0"/>
-          <w:numId w:val="2"/>
-        </w:numPr>
-        <w:ind w:hanging="0" w:left="0"/>
-        <w:rPr/>
-      </w:pPr>
-      <w:bookmarkStart w:id="1" w:name="_toc47"/>
-      <w:bookmarkEnd w:id="1"/>
-      <w:r>
-        <w:rPr/>
-        <w:t>Instructions</w:t>
-      </w:r>
-    </w:p>
-    <w:p>
-      <w:pPr>
-        <w:pStyle w:val="BodyText"/>
-        <w:ind w:hanging="0" w:left="0"/>
-        <w:rPr/>
-      </w:pPr>
-      <w:r>
-        <w:rPr/>
-      </w:r>
-    </w:p>
-    <w:p>
-      <w:pPr>
-        <w:pStyle w:val="BodyText"/>
-        <w:ind w:hanging="0" w:left="0"/>
-        <w:rPr/>
-      </w:pPr>
-      <w:r>
-        <w:rPr/>
-        <w:t xml:space="preserve">The following instructions should be followed after installing a fresh copy of Windows onto a KindWorks computer.  </w:t>
+        <w:t>after</w:t>
+      </w:r>
+      <w:r>
+        <w:rPr/>
+        <w:t xml:space="preserve"> installing a fresh copy of Windows onto a KindWorks computer.  </w:t>
       </w:r>
       <w:r>
         <w:rPr>
@@ -783,7 +395,7 @@
         </w:rPr>
         <w:t>curl.exe -L “</w:t>
       </w:r>
-      <w:hyperlink r:id="rId3">
+      <w:hyperlink r:id="rId2">
         <w:r>
           <w:rPr>
             <w:rStyle w:val="Hyperlink"/>
@@ -876,6 +488,7 @@
           <w:numId w:val="5"/>
         </w:numPr>
         <w:bidi w:val="0"/>
+        <w:spacing w:lineRule="auto" w:line="360"/>
         <w:jc w:val="left"/>
         <w:rPr/>
       </w:pPr>
@@ -903,6 +516,7 @@
           <w:numId w:val="5"/>
         </w:numPr>
         <w:bidi w:val="0"/>
+        <w:spacing w:lineRule="auto" w:line="360"/>
         <w:jc w:val="left"/>
         <w:rPr/>
       </w:pPr>
@@ -933,11 +547,9 @@
           <w:numId w:val="5"/>
         </w:numPr>
         <w:bidi w:val="0"/>
-        <w:jc w:val="left"/>
-        <w:rPr>
-          <w:b w:val="false"/>
-          <w:bCs w:val="false"/>
-        </w:rPr>
+        <w:spacing w:lineRule="auto" w:line="360"/>
+        <w:jc w:val="left"/>
+        <w:rPr/>
       </w:pPr>
       <w:r>
         <w:rPr>
@@ -969,11 +581,9 @@
           <w:numId w:val="5"/>
         </w:numPr>
         <w:bidi w:val="0"/>
-        <w:jc w:val="left"/>
-        <w:rPr>
-          <w:b w:val="false"/>
-          <w:bCs w:val="false"/>
-        </w:rPr>
+        <w:spacing w:lineRule="auto" w:line="360"/>
+        <w:jc w:val="left"/>
+        <w:rPr/>
       </w:pPr>
       <w:r>
         <w:rPr>
@@ -1005,6 +615,7 @@
           <w:numId w:val="5"/>
         </w:numPr>
         <w:bidi w:val="0"/>
+        <w:spacing w:lineRule="auto" w:line="360"/>
         <w:jc w:val="left"/>
         <w:rPr/>
       </w:pPr>
@@ -1038,6 +649,7 @@
           <w:numId w:val="5"/>
         </w:numPr>
         <w:bidi w:val="0"/>
+        <w:spacing w:lineRule="auto" w:line="360"/>
         <w:jc w:val="left"/>
         <w:rPr/>
       </w:pPr>
@@ -1100,7 +712,7 @@
         </w:rPr>
         <w:t>This script copies the script files to the C</w:t>
       </w:r>
-      <w:hyperlink r:id="rId4">
+      <w:hyperlink r:id="rId3">
         <w:r>
           <w:rPr>
             <w:rStyle w:val="Hyperlink"/>
@@ -1791,7 +1403,7 @@
         </w:rPr>
         <w:t xml:space="preserve">If a shortcut to Update Apps is not located on the Desktop, either run the Bootup Bypass Script.cmd again, or go to </w:t>
       </w:r>
-      <w:hyperlink r:id="rId5">
+      <w:hyperlink r:id="rId4">
         <w:r>
           <w:rPr>
             <w:rStyle w:val="Hyperlink"/>
@@ -2172,15 +1784,31 @@
     </w:p>
     <w:p>
       <w:pPr>
-        <w:pStyle w:val="Heading"/>
+        <w:pStyle w:val="Heading3"/>
+        <w:keepNext w:val="true"/>
+        <w:widowControl/>
         <w:numPr>
           <w:ilvl w:val="2"/>
           <w:numId w:val="3"/>
         </w:numPr>
-        <w:rPr/>
-      </w:pPr>
-      <w:r>
-        <w:rPr/>
+        <w:suppressAutoHyphens w:val="true"/>
+        <w:bidi w:val="0"/>
+        <w:ind w:hanging="0" w:left="0"/>
+        <w:jc w:val="left"/>
+        <w:rPr>
+          <w:rFonts w:ascii="Liberation Sans" w:hAnsi="Liberation Sans" w:eastAsia="Microsoft YaHei" w:cs="Arial"/>
+          <w:color w:val="auto"/>
+          <w:kern w:val="2"/>
+          <w:lang w:val="en-US" w:eastAsia="zh-CN" w:bidi="hi-IN"/>
+        </w:rPr>
+      </w:pPr>
+      <w:r>
+        <w:rPr>
+          <w:rFonts w:eastAsia="Microsoft YaHei" w:cs="Arial"/>
+          <w:color w:val="auto"/>
+          <w:kern w:val="2"/>
+          <w:lang w:val="en-US" w:eastAsia="zh-CN" w:bidi="hi-IN"/>
+        </w:rPr>
         <w:t>Choose the KindWorks power profile</w:t>
       </w:r>
     </w:p>
@@ -2195,6 +1823,7 @@
       </w:pPr>
       <w:r>
         <w:rPr/>
+        <w:t xml:space="preserve">The purpose of these steps it to improve the power consumption settings of the laptop, and adjust the times that the laptop goes to sleep or turns off the display when left idle. </w:t>
       </w:r>
     </w:p>
     <w:p>
@@ -2363,8 +1992,28 @@
         <w:t>“</w:t>
       </w:r>
       <w:r>
-        <w:rPr/>
-        <w:t>KindWorks” should now appear under “Plans shown on the battery meter”</w:t>
+        <w:rPr>
+          <w:b/>
+          <w:bCs/>
+        </w:rPr>
+        <w:t>KindWorks</w:t>
+      </w:r>
+      <w:r>
+        <w:rPr/>
+        <w:t>” should now appear under “</w:t>
+      </w:r>
+      <w:r>
+        <w:rPr>
+          <w:b/>
+          <w:bCs/>
+          <w:i/>
+          <w:iCs/>
+        </w:rPr>
+        <w:t>Plans shown on the battery meter</w:t>
+      </w:r>
+      <w:r>
+        <w:rPr/>
+        <w:t>”</w:t>
       </w:r>
     </w:p>
     <w:p>
@@ -2400,7 +2049,7 @@
                     </pic:cNvPicPr>
                   </pic:nvPicPr>
                   <pic:blipFill>
-                    <a:blip r:embed="rId6"/>
+                    <a:blip r:embed="rId5"/>
                     <a:srcRect l="-254" t="-587" r="-254" b="-587"/>
                     <a:stretch>
                       <a:fillRect/>
@@ -2542,6 +2191,348 @@
       <w:r>
         <w:rPr/>
         <w:t xml:space="preserve"> application to get your benchmark test values.</w:t>
+      </w:r>
+    </w:p>
+    <w:p>
+      <w:pPr>
+        <w:pStyle w:val="BodyText"/>
+        <w:spacing w:before="0" w:after="140"/>
+        <w:rPr/>
+      </w:pPr>
+      <w:r>
+        <w:rPr/>
+      </w:r>
+    </w:p>
+    <w:p>
+      <w:pPr>
+        <w:pStyle w:val="Heading1"/>
+        <w:numPr>
+          <w:ilvl w:val="0"/>
+          <w:numId w:val="2"/>
+        </w:numPr>
+        <w:ind w:hanging="0" w:left="0"/>
+        <w:rPr/>
+      </w:pPr>
+      <w:bookmarkStart w:id="1" w:name="_toc26"/>
+      <w:bookmarkEnd w:id="1"/>
+      <w:r>
+        <w:rPr/>
+        <w:t>Brief Script Descriptions</w:t>
+      </w:r>
+    </w:p>
+    <w:p>
+      <w:pPr>
+        <w:pStyle w:val="Normal"/>
+        <w:bidi w:val="0"/>
+        <w:jc w:val="left"/>
+        <w:rPr/>
+      </w:pPr>
+      <w:r>
+        <w:rPr/>
+        <w:t xml:space="preserve">Below are quick descriptions of each script.  </w:t>
+      </w:r>
+    </w:p>
+    <w:p>
+      <w:pPr>
+        <w:pStyle w:val="Heading2"/>
+        <w:numPr>
+          <w:ilvl w:val="0"/>
+          <w:numId w:val="0"/>
+        </w:numPr>
+        <w:bidi w:val="0"/>
+        <w:ind w:hanging="0" w:left="0"/>
+        <w:jc w:val="left"/>
+        <w:rPr/>
+      </w:pPr>
+      <w:r>
+        <w:rPr/>
+      </w:r>
+    </w:p>
+    <w:p>
+      <w:pPr>
+        <w:pStyle w:val="Heading2"/>
+        <w:keepNext w:val="true"/>
+        <w:widowControl/>
+        <w:numPr>
+          <w:ilvl w:val="1"/>
+          <w:numId w:val="4"/>
+        </w:numPr>
+        <w:suppressAutoHyphens w:val="true"/>
+        <w:bidi w:val="0"/>
+        <w:ind w:hanging="0" w:left="0"/>
+        <w:jc w:val="left"/>
+        <w:rPr>
+          <w:rFonts w:ascii="Liberation Sans" w:hAnsi="Liberation Sans" w:eastAsia="Microsoft YaHei" w:cs="Arial"/>
+          <w:color w:val="auto"/>
+          <w:kern w:val="2"/>
+          <w:lang w:val="en-US" w:eastAsia="zh-CN" w:bidi="hi-IN"/>
+        </w:rPr>
+      </w:pPr>
+      <w:r>
+        <w:rPr>
+          <w:rFonts w:eastAsia="Microsoft YaHei" w:cs="Arial"/>
+          <w:color w:val="auto"/>
+          <w:kern w:val="2"/>
+          <w:lang w:val="en-US" w:eastAsia="zh-CN" w:bidi="hi-IN"/>
+        </w:rPr>
+        <w:t>Bootup Bypass Script.cmd</w:t>
+      </w:r>
+    </w:p>
+    <w:p>
+      <w:pPr>
+        <w:pStyle w:val="Normal"/>
+        <w:bidi w:val="0"/>
+        <w:jc w:val="left"/>
+        <w:rPr/>
+      </w:pPr>
+      <w:r>
+        <w:rPr/>
+        <w:t xml:space="preserve">The purpose of this command prompt script is to launch the Initialize Script.ps1 script in a PowerShell window with the proper administrative credentials needed to run unsigned PowerShell scripts in Windows.  When launched, it will prompt the user to click OK to elevate privileges, which is done on purpose, by design.  Otherwise, a fresh copy of Windows will not allow a new user to run unsigned PowerShell scripts by policy.  This script also copies the necessary files over to the </w:t>
+      </w:r>
+      <w:r>
+        <w:rPr>
+          <w:b w:val="false"/>
+          <w:bCs w:val="false"/>
+        </w:rPr>
+        <w:t>C:\</w:t>
+      </w:r>
+      <w:hyperlink r:id="rId6">
+        <w:r>
+          <w:rPr>
+            <w:rStyle w:val="Hyperlink"/>
+            <w:b w:val="false"/>
+            <w:bCs w:val="false"/>
+          </w:rPr>
+          <w:t>KindworksScripts</w:t>
+        </w:r>
+      </w:hyperlink>
+      <w:r>
+        <w:rPr>
+          <w:b w:val="false"/>
+          <w:bCs w:val="false"/>
+        </w:rPr>
+        <w:t xml:space="preserve"> folder in order to facilitate future use.</w:t>
+      </w:r>
+    </w:p>
+    <w:p>
+      <w:pPr>
+        <w:pStyle w:val="Heading2"/>
+        <w:numPr>
+          <w:ilvl w:val="1"/>
+          <w:numId w:val="4"/>
+        </w:numPr>
+        <w:bidi w:val="0"/>
+        <w:ind w:hanging="0" w:left="0"/>
+        <w:jc w:val="left"/>
+        <w:rPr/>
+      </w:pPr>
+      <w:r>
+        <w:rPr/>
+      </w:r>
+    </w:p>
+    <w:p>
+      <w:pPr>
+        <w:pStyle w:val="Heading2"/>
+        <w:numPr>
+          <w:ilvl w:val="1"/>
+          <w:numId w:val="4"/>
+        </w:numPr>
+        <w:bidi w:val="0"/>
+        <w:ind w:hanging="0" w:left="0"/>
+        <w:jc w:val="left"/>
+        <w:rPr/>
+      </w:pPr>
+      <w:r>
+        <w:rPr/>
+        <w:t>Initialize Script.ps1</w:t>
+      </w:r>
+    </w:p>
+    <w:p>
+      <w:pPr>
+        <w:pStyle w:val="Normal"/>
+        <w:bidi w:val="0"/>
+        <w:jc w:val="left"/>
+        <w:rPr/>
+      </w:pPr>
+      <w:r>
+        <w:rPr/>
+        <w:t>This script should be used on a computer that has just had its operating system installed fresh.  The purpose of this script is to perform a bunch of one-time preparation tasks.  The script will then install a series of applications, and will place shortcuts to those applications in folders on the user’s desktop.</w:t>
+      </w:r>
+    </w:p>
+    <w:p>
+      <w:pPr>
+        <w:pStyle w:val="Normal"/>
+        <w:bidi w:val="0"/>
+        <w:jc w:val="left"/>
+        <w:rPr/>
+      </w:pPr>
+      <w:r>
+        <w:rPr/>
+      </w:r>
+    </w:p>
+    <w:p>
+      <w:pPr>
+        <w:pStyle w:val="Heading2"/>
+        <w:keepNext w:val="true"/>
+        <w:widowControl/>
+        <w:numPr>
+          <w:ilvl w:val="1"/>
+          <w:numId w:val="4"/>
+        </w:numPr>
+        <w:suppressAutoHyphens w:val="true"/>
+        <w:bidi w:val="0"/>
+        <w:ind w:hanging="0" w:left="0"/>
+        <w:jc w:val="left"/>
+        <w:rPr>
+          <w:rFonts w:ascii="Liberation Sans" w:hAnsi="Liberation Sans" w:eastAsia="Microsoft YaHei" w:cs="Arial"/>
+          <w:color w:val="auto"/>
+          <w:kern w:val="2"/>
+          <w:lang w:val="en-US" w:eastAsia="zh-CN" w:bidi="hi-IN"/>
+        </w:rPr>
+      </w:pPr>
+      <w:r>
+        <w:rPr>
+          <w:rFonts w:eastAsia="Microsoft YaHei" w:cs="Arial"/>
+          <w:color w:val="auto"/>
+          <w:kern w:val="2"/>
+          <w:lang w:val="en-US" w:eastAsia="zh-CN" w:bidi="hi-IN"/>
+        </w:rPr>
+        <w:t>Update Apps.cmd</w:t>
+      </w:r>
+    </w:p>
+    <w:p>
+      <w:pPr>
+        <w:pStyle w:val="Normal"/>
+        <w:bidi w:val="0"/>
+        <w:jc w:val="left"/>
+        <w:rPr/>
+      </w:pPr>
+      <w:r>
+        <w:rPr/>
+        <w:t>The purpose of this command prompt script is to launch the Update Apps.ps1 script in a PowerShell window with the proper administrative credentials needed to run unsigned PowerShell scripts in Windows.  When launched, it will prompt the user to click OK to elevate privileges, which is done on purpose, by design.  Otherwise, a fresh copy of Windows will not allow a new user to run unsigned PowerShell scripts by policy.</w:t>
+      </w:r>
+    </w:p>
+    <w:p>
+      <w:pPr>
+        <w:pStyle w:val="BodyText"/>
+        <w:widowControl/>
+        <w:numPr>
+          <w:ilvl w:val="0"/>
+          <w:numId w:val="0"/>
+        </w:numPr>
+        <w:suppressAutoHyphens w:val="true"/>
+        <w:bidi w:val="0"/>
+        <w:ind w:hanging="0" w:left="0"/>
+        <w:jc w:val="left"/>
+        <w:rPr>
+          <w:rFonts w:ascii="Liberation Sans" w:hAnsi="Liberation Sans" w:eastAsia="Microsoft YaHei" w:cs="Arial"/>
+          <w:color w:val="auto"/>
+          <w:kern w:val="2"/>
+          <w:lang w:val="en-US" w:eastAsia="zh-CN" w:bidi="hi-IN"/>
+        </w:rPr>
+      </w:pPr>
+      <w:r>
+        <w:rPr>
+          <w:rFonts w:eastAsia="Microsoft YaHei" w:cs="Arial" w:ascii="Liberation Sans" w:hAnsi="Liberation Sans"/>
+          <w:color w:val="auto"/>
+          <w:kern w:val="2"/>
+          <w:lang w:val="en-US" w:eastAsia="zh-CN" w:bidi="hi-IN"/>
+        </w:rPr>
+      </w:r>
+    </w:p>
+    <w:p>
+      <w:pPr>
+        <w:pStyle w:val="Heading2"/>
+        <w:keepNext w:val="true"/>
+        <w:widowControl/>
+        <w:numPr>
+          <w:ilvl w:val="1"/>
+          <w:numId w:val="4"/>
+        </w:numPr>
+        <w:suppressAutoHyphens w:val="true"/>
+        <w:bidi w:val="0"/>
+        <w:ind w:hanging="0" w:left="0"/>
+        <w:jc w:val="left"/>
+        <w:rPr>
+          <w:rFonts w:ascii="Liberation Sans" w:hAnsi="Liberation Sans" w:eastAsia="Microsoft YaHei" w:cs="Arial"/>
+          <w:color w:val="auto"/>
+          <w:kern w:val="2"/>
+          <w:lang w:val="en-US" w:eastAsia="zh-CN" w:bidi="hi-IN"/>
+        </w:rPr>
+      </w:pPr>
+      <w:r>
+        <w:rPr>
+          <w:rFonts w:eastAsia="Microsoft YaHei" w:cs="Arial"/>
+          <w:color w:val="auto"/>
+          <w:kern w:val="2"/>
+          <w:lang w:val="en-US" w:eastAsia="zh-CN" w:bidi="hi-IN"/>
+        </w:rPr>
+        <w:t>Update Apps.ps1</w:t>
+      </w:r>
+    </w:p>
+    <w:p>
+      <w:pPr>
+        <w:pStyle w:val="Normal"/>
+        <w:bidi w:val="0"/>
+        <w:jc w:val="left"/>
+        <w:rPr/>
+      </w:pPr>
+      <w:r>
+        <w:rPr/>
+        <w:t>The purpose of this script is to update all of the applications that KindWorks installed on the refurbished computer.  The value of this script is that, once launched, it updates multiple applications, saving the user significant time.  This relies on the Chocolately application to update the applications.</w:t>
+      </w:r>
+    </w:p>
+    <w:p>
+      <w:pPr>
+        <w:pStyle w:val="Normal"/>
+        <w:bidi w:val="0"/>
+        <w:jc w:val="left"/>
+        <w:rPr/>
+      </w:pPr>
+      <w:r>
+        <w:rPr/>
+      </w:r>
+    </w:p>
+    <w:p>
+      <w:pPr>
+        <w:pStyle w:val="Heading2"/>
+        <w:keepNext w:val="true"/>
+        <w:widowControl/>
+        <w:numPr>
+          <w:ilvl w:val="0"/>
+          <w:numId w:val="0"/>
+        </w:numPr>
+        <w:suppressAutoHyphens w:val="true"/>
+        <w:bidi w:val="0"/>
+        <w:ind w:hanging="0" w:left="0"/>
+        <w:jc w:val="left"/>
+        <w:rPr>
+          <w:rFonts w:ascii="Liberation Sans" w:hAnsi="Liberation Sans" w:eastAsia="Microsoft YaHei" w:cs="Arial"/>
+          <w:color w:val="auto"/>
+          <w:kern w:val="2"/>
+          <w:lang w:val="en-US" w:eastAsia="zh-CN" w:bidi="hi-IN"/>
+        </w:rPr>
+      </w:pPr>
+      <w:r>
+        <w:rPr>
+          <w:rFonts w:eastAsia="Microsoft YaHei" w:cs="Arial"/>
+          <w:color w:val="auto"/>
+          <w:kern w:val="2"/>
+          <w:lang w:val="en-US" w:eastAsia="zh-CN" w:bidi="hi-IN"/>
+        </w:rPr>
+        <w:t>KindWorks.pow</w:t>
+      </w:r>
+    </w:p>
+    <w:p>
+      <w:pPr>
+        <w:pStyle w:val="Normal"/>
+        <w:bidi w:val="0"/>
+        <w:jc w:val="left"/>
+        <w:rPr/>
+      </w:pPr>
+      <w:r>
+        <w:rPr/>
+        <w:t xml:space="preserve">This is a “power plan” configuration file for Windows.  It is a collection of hardware and system settings that manages how the computer uses power.  This files uses standard settings that KindWorks has used for a long time.  </w:t>
       </w:r>
     </w:p>
     <w:sectPr>

</xml_diff>